<commit_message>
audio: completely rewrite Scenario 2 based on Anatoly Fedorov original clinical transcripts (100m ocean depth, unquenchable hearth, four elements/Light of Mine, and garden of private world with lighthouse law)
</commit_message>
<xml_diff>
--- a/baza/медитации_и_аудио/МЕДИТАЦИИ_СЦЕНАРИЙ_2_Я_ОСТАЮСЬ_СОБОЙ_МАГИГ.docx
+++ b/baza/медитации_и_аудио/МЕДИТАЦИИ_СЦЕНАРИЙ_2_Я_ОСТАЮСЬ_СОБОЙ_МАГИГ.docx
@@ -13,7 +13,7 @@
           <w:color w:val="1F4E5B"/>
           <w:sz w:val="32"/>
         </w:rPr>
-        <w:t>СЦЕНАРИЙ 2: «Я ОСТАЮСЬ СОБОЙ» (Маршрут emotions — тревога и зависимость)</w:t>
+        <w:t>СЦЕНАРИЙ 2: «Я ОСТАЮСЬ СОБОЙ» (Маршрут emotions — тревога и эмоциональная зависимость)</w:t>
       </w:r>
     </w:p>
     <w:p>
@@ -28,7 +28,9 @@
           <w:color w:val="555555"/>
           <w:sz w:val="22"/>
         </w:rPr>
-        <w:t>Монументальный свод 3-х полных трансовых сессий без сокращений (12–15 минут звучания)</w:t>
+        <w:t>Полные канонические трансовые сессии по авторскому методу Анатолия Фёдорова (МАГиГ)</w:t>
+        <w:br/>
+        <w:t>Оригинальные клинические метафоры: Глубина 100м, Неугасимый очаг, Четыре стихии и Сад личного мира</w:t>
         <w:br/>
         <w:t>Спикер: Федоров Анатолий Игоревич (Семейный психолог, гипнолог, проректор МАГиГ)</w:t>
       </w:r>
@@ -44,7 +46,7 @@
           <w:color w:val="0E6E5D"/>
           <w:sz w:val="26"/>
         </w:rPr>
-        <w:t>🎧 2.1. МЕДИТАЦИЯ: «ЭКСТРЕННОЕ ЗАЗЕМЛЕНИЕ: ВОЗВРАЩЕНИЕ ПОЧВЫ ПОД НОГАМИ» (Урок 3, 432 Hz)</w:t>
+        <w:t>🎧 2.1. МЕДИТАЦИЯ: «ГЛУБИНА 100 МЕТРОВ И НЕУГАСИМЫЙ ОЧАГ: ВОЗВРАЩЕНИЕ ПОЧВЫ ПОД НОГАМИ» (Урок 3, 432 Hz)</w:t>
       </w:r>
     </w:p>
     <w:p>
@@ -67,15 +69,15 @@
           <w:rFonts w:ascii="Calibri" w:hAnsi="Calibri"/>
           <w:sz w:val="19"/>
         </w:rPr>
-        <w:t>• Главная мишень: Купирование мысленной жвачки (руминаций) и тревоги ожидания сообщений/реакций партнера.</w:t>
+        <w:t>• Главная мишень: Купирование мысленной жвачки, панической тревоги ожидания звонков/сообщений и страха чужого молчания.</w:t>
         <w:br/>
-        <w:t>• Соматический фокус: Дыхание 3-2-6, смещение центра тяжести в таз, прорастание корней в монолитные скалы, расслабление трапеций.</w:t>
+        <w:t>• Соматический фокус: Мягкий расслабленный взгляд, расслабление жевательных мышц лица, опускание плеч, тяжесть и тепло в кистях, плотное объятие глубинного давления воды.</w:t>
         <w:br/>
-        <w:t>• Терапевтический результат: Остановка внутреннего диалога. Возврат в тело из чужой головы. Активация нерушимой опоры.</w:t>
+        <w:t>• Терапевтический результат: Осознание вечной внутренней тишины на глубине 100 метров, куда не доходят бури с поверхности. Соединение с Неугасимым Очагом ценности, который невозможно затушить снаружи.</w:t>
         <w:br/>
-        <w:t>• Параметры начитки: Хронометраж 12–14 мин (~1100 слов) | Музыка FlowMusic 432 Hz, Ре минор | Дыхательный ритм 3-2-6</w:t>
+        <w:t>• Параметры начитки: Хронометраж 12–14 мин (~1050 слов) | Музыка FlowMusic 432 Hz, Ре минор | Канонический голос Анатолия Фёдорова</w:t>
         <w:br/>
-        <w:t>• Архитектура Косички: А1 (Лесной дом и сброс мокрого рюкзака) ➔ Б1 (Корни в граните до центра земли) ➔ В (Ядро: Океан 50м, чугунный якорь и Белый Маяк) ➔ Б2 (Подъем силы земли в тело) ➔ А2 (Рубиновые угли и чай у камина)</w:t>
+        <w:t>• Архитектура Косички: А1 (Океан и поверхность волн) ➔ Б1 (Погружение в глубину 100м, теплое давление воды) ➔ В (Ядро: Старый каменный дом в центре груди и Неугасимый очаг с рождения) ➔ Б2 (Тепло очага расходится по плечам, рукам, животу и стопам) ➔ А2 (Всплытие на поверхность хозяином состояния)</w:t>
       </w:r>
     </w:p>
     <w:p>
@@ -87,37 +89,168 @@
           <w:rFonts w:ascii="Calibri" w:hAnsi="Calibri"/>
           <w:sz w:val="21"/>
         </w:rPr>
-        <w:t>[Музыкальное вступление — Пауза 6 сек]</w:t>
+        <w:t>[Музыкальное вступление: обволакивающий гул 432 Гц — Пауза 6 сек]</w:t>
         <w:br/>
         <w:br/>
-        <w:t xml:space="preserve">Устройтесь так, чтобы тело получило абсолютную, монолитную опору. Почувствуйте поверхность под собой не просто как мебель, а как продолжение земной коры, которая держит вас прямо сейчас. [Пауза 3 сек]. Мы начинаем погружение. Сделайте медленный, плотный вдох, отсчитывая про себя три секунды. Раз... два... три... Задержите этот объем воздуха внутри себя на две секунды. Раз... два... И теперь позвольте воздуху медленно, тягуче покинуть ваши легкие на шесть счетов. Раз... два... три... четыре... пять... шесть... [Пауза 5 сек]. </w:t>
+        <w:t>Устройся удобно. Так, чтобы телу было абсолютно комфортно. [Пауза 3 сек]</w:t>
+        <w:br/>
+        <w:t xml:space="preserve">Позволь себе занять столько пространства, сколько нужно. </w:t>
+        <w:br/>
+        <w:t xml:space="preserve">И пока твое внимание мягко переносится внутрь... мышцы лица становятся чуть более спокойными. </w:t>
+        <w:br/>
+        <w:t xml:space="preserve">Лоб... виски... мягкий, расслабленный взгляд. </w:t>
+        <w:br/>
+        <w:t>Если тебе хочется — ты можешь закрыть глаза. А можешь просто расслабить взгляд и позволить векам тяжело опуститься. [Пауза 5 сек]</w:t>
         <w:br/>
         <w:br/>
-        <w:t>Повторите этот ритм. Вдох, вбирающий в себя плотность момента. Задержка, останавливающая бег времени. И длинный, освобождающий выдох, вместе с которым из ваших мышц вытекает напряжение, словно талый снег весной. [Пауза 5 сек]. С каждым таким циклом вы чувствуете, как ваш центр тяжести смещается вниз. Голова становится легкой, пустой и ясной, а таз и бедра наливаются приятным, теплым свинцом. Ощутите, как тяжелый, липкий туман дневной суеты, чужих взглядов и невысказанной тревоги стекает с ваших плеч, с лопаток, по позвоночнику вниз — и уходит в землю. Тело обретает вес. Тело обретает право быть здесь. [Пауза 8 сек].</w:t>
+        <w:t xml:space="preserve">Лицо расслабляется. Нижняя челюсть становится мягкой. </w:t>
+        <w:br/>
+        <w:t xml:space="preserve">Плечи опускаются чуть ниже... Шея освобождается от дневного напряжения. </w:t>
+        <w:br/>
+        <w:t xml:space="preserve">И ты можешь почувствовать, как руки становятся чуточку тяжелее... А кисти — теплее. </w:t>
+        <w:br/>
+        <w:t>И пока тело отдыхает, мысли могут на время уйти куда-то вглубь. Туда, где всегда тихо. [Пауза 6 сек]</w:t>
         <w:br/>
         <w:br/>
-        <w:t xml:space="preserve">Представьте, что вы стоите на пороге старого, надежного лесного дома. Снаружи хлещет холодный осенний ливень, ветер гнет деревья, а на ваших плечах висит намокший, невыносимо тяжелый рюкзак, набитый чужими ожиданиями и камнями тревоги. Лямки впились в плечи. Вы беретесь за холодное кованое кольцо массивной дубовой двери. Нажимаете. Дверь с глухим, тяжелым скрипом поддается, впуская вас внутрь. Вы делаете шаг за порог. [Пауза 5 сек]. </w:t>
+        <w:t>[Нитка А1: Океан и поверхностные волны]</w:t>
+        <w:br/>
+        <w:t xml:space="preserve">Вот представь себе океан. Его бескрайнюю поверхность. </w:t>
+        <w:br/>
+        <w:t xml:space="preserve">Там, наверху, бывает всякое. Волны... Порывистый ветер гоняет пену по гребням. </w:t>
+        <w:br/>
+        <w:t xml:space="preserve">Иногда шторм, иногда внезапная буря, иногда зыбкое затишье. Поверхность меняется каждую минуту. </w:t>
+        <w:br/>
+        <w:t xml:space="preserve">Но есть одна вещь, которую знает каждый, кто хоть раз нырял по-настоящему глубоко. </w:t>
+        <w:br/>
+        <w:t>Чем глубже ты опускаешься, тем тише становится. [Пауза 6 сек]</w:t>
         <w:br/>
         <w:br/>
-        <w:t>Звук бури мгновенно отрезается. Вы толкаете дверь спиной, и мощная стальная защелка падает в паз с успокаивающим, металлическим щелчком. Клац. Вы в безопасности. [Пауза 4 сек]. Вы снимаете с плеч этот мокрый, тяжелый рюкзак и позволяете ему с глухим стуком упасть на деревянный пол у порога. Выдыхайте. Оставьте его там. Впереди, в полумраке комнаты, мерно потрескивает огонь в большом каменном камине. Отблески пламени танцуют на деревянных стенах, пахнет сухими дровами, смолой и уютом. Вы подходите ближе к огню, садитесь в глубокое, кожаное кресло, которое словно обнимает вас, принимая всю вашу тяжесть. [Пауза 8 сек].</w:t>
+        <w:t>[Нитка Б1: Погружение на глубину 100 метров]</w:t>
+        <w:br/>
+        <w:t xml:space="preserve">И на глубине двадцати метров волны уже далеко. </w:t>
+        <w:br/>
+        <w:t xml:space="preserve">На глубине пятидесяти метров ветер перестает существовать. </w:t>
+        <w:br/>
+        <w:t xml:space="preserve">А еще глубже... около ста метров... нет ничего, кроме плотной, густой, целебной тишины. </w:t>
+        <w:br/>
+        <w:t xml:space="preserve">Там нет чужих голосов. </w:t>
+        <w:br/>
+        <w:t xml:space="preserve">Там нет чужих оценок. </w:t>
+        <w:br/>
+        <w:t xml:space="preserve">Там нет даже чужого молчания. </w:t>
+        <w:br/>
+        <w:t>Только ровное, мягкое, глубокое давление воды, которое обнимает твое тело целиком, как огромная, теплая, бережная ладонь. [Пауза 7 сек]</w:t>
         <w:br/>
         <w:br/>
-        <w:t>Переведите внимание на ваши стопы. Почувствуйте, как от подошв ваших ног начинают прорастать мощные, энергетические корни. Они легко пробивают пол этого дома, уходя глубоко в темную, влажную землю. Они прошивают мягкий грунт, сплетаются с корнями древних вековых дубов. [Пауза 5 сек]. Ваши корни уходят все глубже и глубже. Вот они достигают холодных, гранитных пластов, проходят сквозь трещины в монолитной скале, неумолимо стремясь к самому сердцу планеты. Вы — дерево, пережившее тысячу бурь. Ваши корни держатся за саму основу мира. Ни один ураган не способен вас вырвать. Ни одно чужое слово не способно вас пошатнуть. [Пауза 8 сек].</w:t>
+        <w:t xml:space="preserve">Эта глубина — твоя. </w:t>
+        <w:br/>
+        <w:t xml:space="preserve">Она была здесь и тогда, когда на поверхности было спокойно. </w:t>
+        <w:br/>
+        <w:t xml:space="preserve">И она была здесь тогда, когда наверху всё трепало, штормило и качало. </w:t>
+        <w:br/>
+        <w:t xml:space="preserve">Глубина остается глубиной всегда. </w:t>
+        <w:br/>
+        <w:t xml:space="preserve">Прямо сейчас твое тело вспоминает это ощущение: ты опускаешься в свою собственную тишину. </w:t>
+        <w:br/>
+        <w:t xml:space="preserve">Чужая неопределенность... чье-то молчание... эмоциональная качка на поверхности — все это остается там, далеко наверху. </w:t>
+        <w:br/>
+        <w:t xml:space="preserve">А здесь, внутри — ровное, спокойное присутствие, которое держит тебя со всех сторон. </w:t>
+        <w:br/>
+        <w:t xml:space="preserve">Почувствуй эту легкую, приятную тяжесть, мягкую заботу. Вода бережно прижимает тебя к самой себе. </w:t>
+        <w:br/>
+        <w:t>И тебе достаточно одного медленного, спокойного выдоха, чтобы опуститься в эту тишину в любой момент. [Пауза 8 сек]</w:t>
         <w:br/>
         <w:br/>
-        <w:t xml:space="preserve">А теперь позвольте вашему сознанию скользнуть еще глубже. Представьте поверхность бушующего океана — это социум, это чужие эмоции, чужие паузы и ледяное молчание. Там, наверху, шторм. Но вы начинаете погружаться. Десять метров вниз... Вода становится темнее, звуки шторма глохнут. Двадцать метров... Течения замедляются. Тридцать... Сорок... Пятьдесят метров на глубину. [Пауза 5 сек]. Здесь царит кристальный, вечный штиль. Абсолютная тишина. Вы видите на дне огромный, чугунный якорь. Он врос в океаническое дно, наполовину занесенный белым песком. Этот якорь — ваша внутренняя правда. Он держит ваш корабль при любой погоде. </w:t>
+        <w:t>[Нитка В: Ядро транса — Старый каменный дом и Неугасимый очаг]</w:t>
+        <w:br/>
+        <w:t xml:space="preserve">А теперь, пока ты находишься в этой защищенной глубине... </w:t>
+        <w:br/>
+        <w:t>Позволь вниманию мягко переместиться в центр твоей груди. [Пауза 4 сек]</w:t>
+        <w:br/>
+        <w:t xml:space="preserve">Там, в самой середине, словно стоит старый каменный дом. </w:t>
+        <w:br/>
+        <w:t xml:space="preserve">Стены его толстые, монолитные, и в то же время прогретые ласковым солнцем. Они сложены из тяжелого, векового камня. </w:t>
+        <w:br/>
+        <w:t>И внутри этого дома горит Очаг. [Пауза 5 сек]</w:t>
         <w:br/>
         <w:br/>
-        <w:t>Почувствуйте в центре своей груди мощный Белый Маяк. Его ровный, пронзительный свет пульсирует сквозь толщу воды. Кто-то может злиться, кто-то может молчать или отстраняться — но это там, на поверхности. А здесь, на глубине пятидесяти метров, ваш чугунный якорь не сдвинется ни на миллиметр. Вы не обязаны реагировать на каждую волну. Вы можете позволить чужой буре просто шуметь наверху. Ваш Белый Маяк горит ровно. Ваша глубина принадлежит только вам. [Пауза 10 сек].</w:t>
+        <w:t xml:space="preserve">Огонь в этом очаге — ровный, живой, мягкий. </w:t>
+        <w:br/>
+        <w:t xml:space="preserve">Он горит очень давно. </w:t>
+        <w:br/>
+        <w:t xml:space="preserve">Он горел, когда тебе было пять лет, и мир вокруг казался огромным. </w:t>
+        <w:br/>
+        <w:t xml:space="preserve">Он горел, когда ты впервые почувствовала, что кто-то рядом. </w:t>
+        <w:br/>
+        <w:t xml:space="preserve">И он продолжал гореть, когда рядом никого не оказалось. </w:t>
+        <w:br/>
+        <w:t xml:space="preserve">Этот огонь загорелся в тот самый день, когда ты появилась на этот свет. </w:t>
+        <w:br/>
+        <w:t xml:space="preserve">И с тех самых пор его невозможно потушить снаружи. </w:t>
+        <w:br/>
+        <w:t xml:space="preserve">Ни чьим-то уходом... </w:t>
+        <w:br/>
+        <w:t xml:space="preserve">Ни чьим-то молчанием... </w:t>
+        <w:br/>
+        <w:t>Ни чьей-то неопределенностью. [Пауза 7 сек]</w:t>
         <w:br/>
         <w:br/>
-        <w:t>Почувствуйте, как оттуда, из самого сердца земли, по вашим мощным корням начинает подниматься горячая, густая сила. Она течет вверх, сквозь гранитные пласты, сквозь влажную почву, достигает ваших стоп и наполняет их теплом. Эта сила поднимается по икрам, бедрам, наполняет таз, живот, растекается по грудной клетке и рукам. Каждая клетка вашего тела наливается плотностью, спокойствием и уверенностью древней скалы. Вы присутствуете в своем теле. Вы заполняете его целиком. [Пауза 8 сек].</w:t>
+        <w:t xml:space="preserve">Потому что этот очаг питается изнутри. Он — твой. </w:t>
+        <w:br/>
+        <w:t xml:space="preserve">Он и есть то самое тепло, та врожденная безусловная ценность, которая принадлежит тебе просто по факту твоего существования. </w:t>
+        <w:br/>
+        <w:t xml:space="preserve">И когда за окнами этого каменного дома дует холодный ветер, идет колючий дождь или стоит тишина, от которой раньше сжималось сердце... </w:t>
+        <w:br/>
+        <w:t>Огонь внутри продолжает гореть ровно, тепло и спокойно. [Пауза 6 сек]</w:t>
         <w:br/>
         <w:br/>
-        <w:t xml:space="preserve">Вы снова сидите перед камином в лесном доме. Огонь уже перегорел, оставив после себя рубиновые, пульсирующие жаром угли. Вы держите в руках тяжелую керамическую кружку с горячим травяным чаем. Тепло от кружки передается вашим ладоням, согревая их. За толстыми стенами дома может происходить что угодно, но здесь — ваше время привала. Ваше безопасное пространство. [Пауза 5 сек]. </w:t>
+        <w:t>[Закрытие Б2: Тепло разливается по телу]</w:t>
+        <w:br/>
+        <w:t xml:space="preserve">От этого очага расходится мягкий, живой жар по стенам, по полу, по всему дому. </w:t>
+        <w:br/>
+        <w:t xml:space="preserve">Точно так же и в твоем теле. </w:t>
+        <w:br/>
+        <w:t xml:space="preserve">Тепло из центра груди мягко расходится по плечам... спускается к рукам... наполняет живот... согревает стопы. </w:t>
+        <w:br/>
+        <w:t xml:space="preserve">Ты можешь положить ладонь себе на грудь, если хочешь. </w:t>
+        <w:br/>
+        <w:t xml:space="preserve">И почувствовать это живое, настоящее тепло. </w:t>
+        <w:br/>
+        <w:t>Оно здесь. Прямо сейчас. Оно принадлежит только тебе. [Пауза 7 сек]</w:t>
         <w:br/>
         <w:br/>
-        <w:t>Сохраняя эту внутреннюю монолитность, этот чугунный якорь внутри, начните мягко возвращаться к поверхности. Сделайте глубокий, свежий вдох... и медленный выдох. Пошевелите кончиками пальцев рук и ног, чувствуя границы своего сильного, отдохнувшего тела. И когда будете готовы, медленно откройте глаза. Вы здесь. Вы в безопасности. Вы — это вы. [Музыкальное завершение — Пауза 6 сек]</w:t>
+        <w:t>[Закрытие А2: Якорение и всплытие]</w:t>
+        <w:br/>
+        <w:t xml:space="preserve">И сейчас, пока это ощущение тепла и устойчивости живет в каждой твоей клетке, сделай глубокий вдох... </w:t>
+        <w:br/>
+        <w:t xml:space="preserve">И медленный, освобождающий выдох. </w:t>
+        <w:br/>
+        <w:t xml:space="preserve">Позволь мышцам запечатлеть это состояние: расслабленное лицо, опущенные плечи, теплые кисти и твердая, монолитная опора под тобой. </w:t>
+        <w:br/>
+        <w:t xml:space="preserve">Это ощущение: «Я на своей земле. Я у себя есть» — останется с тобой навсегда. </w:t>
+        <w:br/>
+        <w:t>И в любой момент, когда тебе понадобится, тебе достаточно почувствовать стопами опору под собой, сделать один длинный выдох — и тело само мгновенно вспомнит эту стометровую глубину и этот негасимый очаг. [Пауза 6 сек]</w:t>
+        <w:br/>
+        <w:br/>
+        <w:t xml:space="preserve">Ты выбираешь стоять на своей земле. </w:t>
+        <w:br/>
+        <w:t xml:space="preserve">Ты выбираешь помнить свое тепло. </w:t>
+        <w:br/>
+        <w:t xml:space="preserve">И когда ты начнешь подниматься вверх с этой глубины, которая теперь навсегда с тобой... </w:t>
+        <w:br/>
+        <w:t>Я досчитаю от одного до пяти, и с каждым числом ты будешь мягко возвращаться сюда. [Пауза 3 сек]</w:t>
+        <w:br/>
+        <w:t xml:space="preserve">Один... Ощущение тепла в груди сохраняется и становится твоим естественным фоном. </w:t>
+        <w:br/>
+        <w:t xml:space="preserve">Два... Дыхание становится чуть более полным, чистым и свежим. </w:t>
+        <w:br/>
+        <w:t xml:space="preserve">Три... Пошевели пальцами рук и ног, почувствуй, как тело просыпается — бодрое, сильное, отдохнувшее. </w:t>
+        <w:br/>
+        <w:t xml:space="preserve">Четыре... Мысли кристально ясные, чистые. Настроение ровное, устойчивое и взрослое. </w:t>
+        <w:br/>
+        <w:t xml:space="preserve">Пять... Сделай глубокий вдох, сладко потянись всем телом и открывай глаза. </w:t>
+        <w:br/>
+        <w:t>Ты здесь. Ты на своей земле. У тебя всё в полном порядке. [Музыкальное завершение — Пауза 6 сек]</w:t>
       </w:r>
     </w:p>
     <w:p>
@@ -131,7 +264,7 @@
           <w:color w:val="0E6E5D"/>
           <w:sz w:val="26"/>
         </w:rPr>
-        <w:t>🎧 2.2. МЕДИТАЦИЯ: «ЭМОЦИОНАЛЬНЫЙ ЩИТ: КАК НЕ ПРИНИМАТЬ ЧУЖУЮ ВИНУ» (Урок 5, 528 Hz)</w:t>
+        <w:t>🎧 2.2. МЕДИТАЦИЯ: «ЧЕТЫРЕ СТИХИИ И СВЕТ МОЕГО: ИСТИННЫЙ ЭМОЦИОНАЛЬНЫЙ ЩИТ» (Урок 5, 528 Hz)</w:t>
       </w:r>
     </w:p>
     <w:p>
@@ -154,15 +287,15 @@
           <w:rFonts w:ascii="Calibri" w:hAnsi="Calibri"/>
           <w:sz w:val="19"/>
         </w:rPr>
-        <w:t>• Главная мишень: Защита от психологических манипуляций, чувства навязанной вины, пассивной агрессии и токсичных проекций.</w:t>
+        <w:t>• Главная мишень: Защита от чужих эмоциональных качелей, манипуляций чувством вины, перекладывания чужой боли и страха потерять себя.</w:t>
         <w:br/>
-        <w:t>• Соматический фокус: Ощущение плотной алмазной границы вокруг тела на расстоянии вытянутой руки, снятие зажима с горла и грудины.</w:t>
+        <w:t>• Соматический фокус: Опора стоп в теплую землю, золотая ось позвоночника, свободное дыхание грудью, расслабление челюсти и трапеций.</w:t>
         <w:br/>
-        <w:t>• Терапевтический результат: Полная психологическая сепарация: способность спокойно возвращать чужую боль автору без оправданий.</w:t>
+        <w:t>• Терапевтический результат: Интеграция четырех стихий (Земля — опора, Вода — глубина покоя, Воздух — дыхание свободы, Огонь — свет жизни) в монолитный Свет Моего. Формирование природной неуязвимости.</w:t>
         <w:br/>
-        <w:t>• Параметры начитки: Хронометраж 12–14 мин (~1050 слов) | Музыка FlowMusic 528 Hz, До мажор</w:t>
+        <w:t>• Параметры начитки: Хронометраж 13–15 мин (~1150 слов) | Музыка FlowMusic 528 Hz, До мажор | Канонический голос Анатолия Фёдорова</w:t>
         <w:br/>
-        <w:t>• Архитектура Косички: А1 (Горная поляна над облаками) ➔ Б1 (Алмазный купол на расстоянии руки) ➔ В (Ядро: Зеркальный щит возврата, формула сепарации) ➔ Б2 (Голубоватое сияние автономности) ➔ А2 (Кристальный воздух и неуязвимость)</w:t>
+        <w:t>• Архитектура Косички: А1 (Священное природное пространство) ➔ Б1 (Контакт тела с опорой) ➔ В (Ядро: Слияние 4-х стихий в Свет Моего, незыблемое право быть собой) ➔ Б2 (Распрямление спины и царственное достоинство) ➔ А2 (Широкое озарение горизонта и безопасность)</w:t>
       </w:r>
     </w:p>
     <w:p>
@@ -174,30 +307,127 @@
           <w:rFonts w:ascii="Calibri" w:hAnsi="Calibri"/>
           <w:sz w:val="21"/>
         </w:rPr>
-        <w:t>[Музыкальное вступление — Пауза 6 сек]</w:t>
+        <w:t>[Музыкальное вступление: звонкий, исцеляющий фон 528 Гц — Пауза 6 сек]</w:t>
         <w:br/>
         <w:br/>
-        <w:t>Сделайте вдох, отпуская все мысли, и выдох, позволяя векам тяжело опуститься. [Пауза 3 сек]. Представьте, что вы стоите на бескрайней горной поляне, высоко над линией облаков. Воздух здесь настолько чист и прозрачен, что каждый вдох наполняет легкие звенящей свежестью, слегка обжигая холодом. Вы стоите на твердой, каменистой почве. Небо над вами — пронзительно синего цвета, без единого облачка. Вы абсолютно одни, в центре своего личного пространства. [Пауза 5 сек].</w:t>
+        <w:t xml:space="preserve">Сделай глубокий вдох, наполняя грудную клетку чистым, свежим воздухом... </w:t>
+        <w:br/>
+        <w:t>И с медленным, тягучим выдохом позволь телу полностью довериться опоре. [Пауза 4 сек]</w:t>
+        <w:br/>
+        <w:t xml:space="preserve">Ты проделала большую внутреннюю работу. </w:t>
+        <w:br/>
+        <w:t xml:space="preserve">Каждый пройденный шаг, каждое осознание, каждый спокойный выдох постепенно складывались внутри тебя в единую, монолитную структуру. </w:t>
+        <w:br/>
+        <w:t>И сегодня мы соединяем все источники твоей внутренней силы воедино. [Пауза 5 сек]</w:t>
         <w:br/>
         <w:br/>
-        <w:t xml:space="preserve">Вытяните правую руку вперед в своем воображении. И медленно, поворачиваясь вокруг своей оси, очертите вокруг себя невидимый круг на расстоянии вытянутой руки. Это — ваша священная граница. Территория вашего "Я". Как только линия замыкается, из этой черты в земле начинает подниматься прозрачный, мерцающий алмазный купол. Он растет вверх, смыкаясь над вашей головой, и уходит глубоко под землю, образуя абсолютную сферу защиты. [Пауза 5 сек]. Этот купол прозрачен, как слеза, но прочен, как метеоритная сталь. Внутри него — только вы, ваши чувства, ваши мысли и ваша правда. </w:t>
+        <w:t xml:space="preserve">Закрой глаза. Почувствуй, как расслабляются виски, щеки, как размыкаются зубы. </w:t>
+        <w:br/>
+        <w:t xml:space="preserve">Плечи мягко опускаются вниз. Руки лежат свободно и тяжело. </w:t>
+        <w:br/>
+        <w:t>Дыхание течет ровно, легко, словно волна теплого прибоя, омывающая берег. [Пауза 6 сек]</w:t>
         <w:br/>
         <w:br/>
-        <w:t>Сейчас представьте, что снаружи этого купола начинают появляться тени. Это чужие упреки. Претензии. Чужой гнев, разочарование или попытки навесить на вас вину. Они летят в вашу сторону, словно острые дротики или темные сгустки энергии. Но как только они касаются внешней поверхности вашего алмазного купола — происходит вспышка. [Пауза 4 сек]. Чужие слова ударяются о невидимую преграду, теряют свою силу, рассыпаются в пыль и медленно оседают на землю, словно сухие осенние листья. Шурх... шурх... Вы стоите внутри и просто наблюдаете. Вы видите, как чужая боль пытается задеть вас, но не может проникнуть сквозь алмазную грань. [Пауза 8 сек].</w:t>
+        <w:t>[Нитка А1 &amp; Б1: Собирание стихий в теле]</w:t>
+        <w:br/>
+        <w:t xml:space="preserve">И сейчас вспомни первую стихию — Землю. </w:t>
+        <w:br/>
+        <w:t xml:space="preserve">Почувствуй, как твои стопы опираются на твердую почву. </w:t>
+        <w:br/>
+        <w:t xml:space="preserve">Представь под собой древнюю, вековую гранитную скалу, которая уходит в самые недра планеты. </w:t>
+        <w:br/>
+        <w:t xml:space="preserve">Этот фундамент выдержит абсолютно любой вес. В нем нет ни единой трещины. Он стоял тысячи лет до тебя и простоит вечность. </w:t>
+        <w:br/>
+        <w:t>Это твоя заземленность. Твоя способность оставаться на ногах при любых внешних вихрях. [Пауза 6 сек]</w:t>
         <w:br/>
         <w:br/>
-        <w:t xml:space="preserve">Вам не нужно оправдываться. Вам не нужно защищаться. Купол делает это за вас. Почувствуйте, как в центре вашей груди формируется холодное, гладкое Зеркало. Это щит возврата. Когда кто-то пытается переложить на вас ответственность за свои чувства, зеркало просто отражает эту энергию обратно. [Пауза 5 сек]. Произнесите сейчас про себя, медленно и веско, чувствуя, как слова резонируют в костях: </w:t>
+        <w:t xml:space="preserve">Вспомни вторую стихию — Воду. </w:t>
         <w:br/>
-        <w:t xml:space="preserve">«Чужой срыв — это не моя вина. [Пауза 2 сек]. Я оставляю твою боль тебе. [Пауза 2 сек]. А себе — оставляю моё достоинство». </w:t>
+        <w:t xml:space="preserve">Ту самую стометровую глубину океана, куда ты можешь опуститься в любой момент. </w:t>
+        <w:br/>
+        <w:t xml:space="preserve">Там, где царит вечный штиль, мягкое обнимающее давление и полная тишина. </w:t>
+        <w:br/>
+        <w:t xml:space="preserve">Вода смывает любую наносную суету, любые чужие слова, растворяя их без следа. </w:t>
+        <w:br/>
+        <w:t>Это твоя эмоциональная чистота и глубина твоего покоя. [Пауза 6 сек]</w:t>
         <w:br/>
         <w:br/>
-        <w:t>Почувствуйте, как после этих слов пространство внутри купола становится еще чище. Чужие проекции отскакивают от вашего зеркального щита и возвращаются к их авторам. Вы больше не контейнер для чужих нерешенных проблем. Вы сбрасываете с себя этот липкий слой чужой ответственности, как старую, тесную одежду. [Пауза 8 сек].</w:t>
+        <w:t xml:space="preserve">Почувствуй третью стихию — Воздух. </w:t>
+        <w:br/>
+        <w:t xml:space="preserve">Сделай свободный вдох. Почувствуй, как воздух легко расширяет твои ребра, наполняя каждую клеточку кислородом и свободой. </w:t>
+        <w:br/>
+        <w:t>Воздух дает тебе способность дышать полной грудью, отпускать старое на каждом выдохе и ясно видеть вещи такими, какие они есть на самом деле, без иллюзий и страха. [Пауза 6 сек]</w:t>
         <w:br/>
         <w:br/>
-        <w:t>Ваш алмазный купол начинает светиться изнутри мягким, голубоватым сиянием. Это свет вашей автономности. Он согревает вас, он питает вас. Находиться внутри этой сферы безопасно и невероятно легко. Ничто извне не может нарушить этот покой без вашего согласия. [Пауза 5 сек].</w:t>
+        <w:t xml:space="preserve">И обратись к четвертой стихии — Огню. </w:t>
+        <w:br/>
+        <w:t xml:space="preserve">Тому самому ровному, живому пламени в очаге твоего каменного дома. </w:t>
+        <w:br/>
+        <w:t xml:space="preserve">Это огонь твоей жизненной силы. Твой внутренний жар, твоя подлинная суть и твое незыблемое право быть собой. </w:t>
+        <w:br/>
+        <w:t xml:space="preserve">Быть любовью. </w:t>
+        <w:br/>
+        <w:t xml:space="preserve">Проявлять свои настоящие чувства. </w:t>
+        <w:br/>
+        <w:t>Открыто говорить о своих истинных желаниях и выбирать только то, что дает тебе свободу, уважение и мир в душе. [Пауза 7 сек]</w:t>
         <w:br/>
         <w:br/>
-        <w:t>Запомните это ощущение алмазной прочности на расстоянии вытянутой руки. Этот купол всегда с вами, невидимый, но абсолютно реальный. Сделайте глубокий, спокойный вдох, вбирая в себя чистоту горного воздуха... И с выдохом мягко пошевелите телом. Откройте глаза. Ваш щит активирован. Вы неуязвимы для чужой вины. [Музыкальное завершение — Пауза 6 сек]</w:t>
+        <w:t>[Нитка В: Ядро транса — Слияние в Свет Моего]</w:t>
+        <w:br/>
+        <w:t xml:space="preserve">И прямо сейчас смотри, как эти четыре стихии начинают соединяться внутри тебя в единый, монолитный луч. </w:t>
+        <w:br/>
+        <w:t>В сияющий, нерушимый Свет Моего. [Пауза 5 сек]</w:t>
+        <w:br/>
+        <w:t xml:space="preserve">Этот свет рождается в центре твоей груди и заливает всё твое существо. </w:t>
+        <w:br/>
+        <w:t xml:space="preserve">Твоя память запечатлевает весь этот путь. </w:t>
+        <w:br/>
+        <w:t xml:space="preserve">Ты можешь помнить всё, с чего всё начиналось: тревогу, накрутку, бесконечные сомнения, болезненные попытки подстроиться под чужое настроение, страх отвержения... </w:t>
+        <w:br/>
+        <w:t>Но всё это было лишь школой. Опытом, который привел тебя в эту точку. [Пауза 6 сек]</w:t>
+        <w:br/>
+        <w:br/>
+        <w:t xml:space="preserve">Посмотри на себя настоящую: ты стоишь на твердой, нерушимой опоре. </w:t>
+        <w:br/>
+        <w:t xml:space="preserve">Каждый твой шаг, каждое осознание превратились в плотную природную силу. Твою собственную силу. </w:t>
+        <w:br/>
+        <w:t xml:space="preserve">Твой внутренний свет невозможно осквернить чужой злостью. </w:t>
+        <w:br/>
+        <w:t xml:space="preserve">Его невозможно приглушить чужим холодом. </w:t>
+        <w:br/>
+        <w:t xml:space="preserve">Когда кто-то снаружи пытается переложить на тебя свою вину, свои страхи или раздражение — эти тени просто растворяются в лучах твоего Света Моего. </w:t>
+        <w:br/>
+        <w:t>Они не могут проникнуть внутрь, потому что там занято: там живет твое достоинство. [Пауза 8 сек]</w:t>
+        <w:br/>
+        <w:br/>
+        <w:t>[Закрытие Б2: Распрямление спины и царственная сила]</w:t>
+        <w:br/>
+        <w:t xml:space="preserve">И пока скала под твоими ногами прорастает корнями глубоко в землю, почувствуй, как твоя спина распрямляется. </w:t>
+        <w:br/>
+        <w:t xml:space="preserve">Грудь дышит широко и свободно. </w:t>
+        <w:br/>
+        <w:t xml:space="preserve">А все твое состояние наполняется чистым чувством завершенности, силы и глубокой, тихой гордости за себя. </w:t>
+        <w:br/>
+        <w:t>Ты не должна заслуживать право на существование. Ты уже здесь. Ты уже дома. [Пауза 7 сек]</w:t>
+        <w:br/>
+        <w:br/>
+        <w:t>[Закрытие А2: Свет маяка озаряет горизонт]</w:t>
+        <w:br/>
+        <w:t xml:space="preserve">И твой внутренний маяк продолжает спокойно светить в тишине. </w:t>
+        <w:br/>
+        <w:t xml:space="preserve">Его мягкий, теплый свет озаряет пространство вокруг: море, землю, открытый чистый горизонт. </w:t>
+        <w:br/>
+        <w:t xml:space="preserve">Ты видишь свой путь ясно и спокойно. </w:t>
+        <w:br/>
+        <w:t xml:space="preserve">Сделай глубокий, наполняющий вдох... И долгий, освежающий выдох. </w:t>
+        <w:br/>
+        <w:t xml:space="preserve">Пошевели пальцами рук и ног. </w:t>
+        <w:br/>
+        <w:t xml:space="preserve">Потянись сладко всем телом, чувствуя всю свою собранность и плотность. </w:t>
+        <w:br/>
+        <w:t xml:space="preserve">И когда будешь готова — открывай глаза. </w:t>
+        <w:br/>
+        <w:t>С возвращением в твою новую, устойчивую реальность. [Музыкальное завершение — Пауза 6 сек]</w:t>
       </w:r>
     </w:p>
     <w:p>
@@ -211,7 +441,7 @@
           <w:color w:val="0E6E5D"/>
           <w:sz w:val="26"/>
         </w:rPr>
-        <w:t>🎧 2.3. АУДИОПРАКТИКА: «СНЯТИЕ ТРЕВОГИ ПРИ МОЛЧАНИИ ИЛИ ОТСТРАНЕНИИ ПАРТНЁРА» (Бонус 3, 528 Hz)</w:t>
+        <w:t>🎧 2.3. АУДИОПРАКТИКА: «САД ЛИЧНОГО МИРА: СНЯТИЕ ТРЕВОГИ ПРИ МОЛЧАНИИ ПАРТНЁРА» (Бонус 3, 528 Hz)</w:t>
       </w:r>
     </w:p>
     <w:p>
@@ -234,15 +464,15 @@
           <w:rFonts w:ascii="Calibri" w:hAnsi="Calibri"/>
           <w:sz w:val="19"/>
         </w:rPr>
-        <w:t>• Главная мишень: Купирование паники брошенности, экстренная остановка компульсивного желания звонить/писать.</w:t>
+        <w:t>• Главная мишень: Снятие острой тревоги при внезапном молчании, дистанцировании или холоде партнера без панических реакций.</w:t>
         <w:br/>
-        <w:t>• Соматический фокус: Переворот телефона экраном вниз, отключение проводов напряжения от груди, тепло взрослой части в ладони.</w:t>
+        <w:t>• Соматический фокус: Стопы плотно стоят на теплой земле сада, шея и плечи сохраняют полное расслабление, челюсть мягкая, автоматический выбор длинного плавного выдоха.</w:t>
         <w:br/>
-        <w:t>• Терапевтический результат: Осознание метафоры морского отлива: берег не бежит за водой. Возврат пульта управления своим состоянием.</w:t>
+        <w:t>• Терапевтический результат: Глубокая интеграция правила Маяка: Маяк не бегает по морю за кораблями. Хозяйка сада не выбегает за калитку в тревоге, сохраняя достоинство и наблюдая за реальными поступками.</w:t>
         <w:br/>
-        <w:t>• Параметры начитки: Хронометраж 9–10 мин (~850 слов) | Музыка FlowMusic 528 Hz, До мажор</w:t>
+        <w:t>• Параметры начитки: Хронометраж 10–12 мин (~950 слов) | Музыка FlowMusic 528 Hz, До мажор | Канонический голос Анатолия Фёдорова</w:t>
         <w:br/>
-        <w:t>• Архитектура Косички: А1 (Океанский берег в тумане) ➔ Б1 (Базальтовая скала под ногами, отключение проводов) ➔ В (Ядро: Отлив океана, возврат пульта себе) ➔ Б2 (Тепло взрослой части в груди) ➔ А2 (Рассеивание тумана, солнце над гладью моря)</w:t>
+        <w:t>• Архитектура Косички: А1 (Цветущий сад личного мира) ➔ Б1 (Стопы на теплой земле, мягкая челюсть, длинный плавный выдох) ➔ В (Ядро: «Маяк не бегает за кораблями — я не выбегаю за ворота сада при чужом молчании», истинное правило выбора) ➔ Б2 (Ровный шаг, спина сохраняет уверенность) ➔ А2 (Солнечные аллеи и хозяйка своей жизни)</w:t>
       </w:r>
     </w:p>
     <w:p>
@@ -254,30 +484,127 @@
           <w:rFonts w:ascii="Calibri" w:hAnsi="Calibri"/>
           <w:sz w:val="21"/>
         </w:rPr>
-        <w:t>[Музыкальное вступление — Пауза 4 сек]</w:t>
+        <w:t>[Музыкальное вступление: теплый гипнотический фон 528 Гц — Пауза 5 сек]</w:t>
         <w:br/>
         <w:br/>
-        <w:t>Прямо сейчас, если ваш телефон лежит рядом экраном вверх — переверните его. Положите его экраном вниз. Отпустите контроль. [Пауза 4 сек]. Закройте глаза. Я знаю это чувство. Это сжимающий, липкий холод в груди, когда молчание другого человека кажется приговором. Когда в тишине просыпается древняя, детская паника: "Меня оставили". Признайте ее. Скажите себе: "Да, мне сейчас страшно". Не гоните этот страх, просто посмотрите на него, как взрослый смотрит на испуганного ребенка. [Пауза 6 сек].</w:t>
+        <w:t xml:space="preserve">Устройся удобно. Закрой глаза. </w:t>
+        <w:br/>
+        <w:t>Сделай спокойный, мягкий вдох... и длинный, плавный, теплый выдох. [Пауза 4 сек]</w:t>
+        <w:br/>
+        <w:t xml:space="preserve">Позволь себе на эти несколько минут полностью оставить внешний мир за порогом. </w:t>
+        <w:br/>
+        <w:t>Никуда не нужно бежать. Ничего не нужно выяснять. Твоя единственная задача сейчас — вернуться к себе. [Пауза 5 сек]</w:t>
         <w:br/>
         <w:br/>
-        <w:t>Представьте, что вы стоите на берегу огромного океана ранним утром. Вокруг висит густой, тяжелый туман. Вы не видите горизонта. Вы слышите только шум волн, скрытых в молочной пелене. Но под вашими босыми ногами — не зыбучий песок. Под вашими ногами — древняя, черная, шершавая базальтовая скала. Монолит, уходящий в недра земли. Почувствуйте ее прохладу и абсолютную непоколебимость. Вы стоите на твердом. Вы не упадете. [Пауза 6 сек].</w:t>
+        <w:t>[Нитка А1: Цветущий сад личного мира]</w:t>
+        <w:br/>
+        <w:t xml:space="preserve">Представь, что свет твоего внутреннего маяка мягко озаряет прекрасное, уединенное место. </w:t>
+        <w:br/>
+        <w:t xml:space="preserve">Это твой Сад. Цветущий, залитый мягким солнечным светом сад твоего личного мира. </w:t>
+        <w:br/>
+        <w:t>Это пространство твоей собственной жизни, в котором ты — единственная мудрая, любящая и заботливая хозяйка. [Пауза 6 сек]</w:t>
         <w:br/>
         <w:br/>
-        <w:t>Сконцентрируйте внимание на своей грудной клетке. Представьте, что от вашего сердца к другому человеку тянутся тонкие, натянутые до звона провода. Это пульс ожидания. По этим проводам вы пытаетесь уловить его настроение, его ответы, его одобрение. Вы отдали пульт управления своим состоянием в чужие руки. [Пауза 5 сек]. Сейчас, мысленно, возьмите эти провода в свои руки. И с глубоким, освобождающим выдохом — отсоедините их. Вытащите штекеры из своей груди. Щелк. Щелк. Почувствуйте, как спадает напряжение. Пульт управления вашим сердцем возвращается к вам. Вы снова принадлежите себе. [Пауза 8 сек].</w:t>
+        <w:t xml:space="preserve">Ты знаешь здесь каждый уголок. </w:t>
+        <w:br/>
+        <w:t xml:space="preserve">Ты сама прокладываешь здесь ровные каменные дорожки. </w:t>
+        <w:br/>
+        <w:t xml:space="preserve">Своими руками сажаешь и поливаешь прекрасные цветы. </w:t>
+        <w:br/>
+        <w:t xml:space="preserve">Ты выращиваешь здесь только то, что приносит тебе умиротворение, вдохновение, радость и душевный покой. </w:t>
+        <w:br/>
+        <w:t xml:space="preserve">Ты сама создаешь правила в этом саду. </w:t>
+        <w:br/>
+        <w:t>Сама решаешь, за какими растениями ухаживать, и кого приглашать к своему теплому очагу. [Пауза 7 сек]</w:t>
         <w:br/>
         <w:br/>
-        <w:t>Посмотрите на океан перед вами. Начался отлив. Вода отступает от берега, обнажая камни. Молчание партнера — это просто океанский отлив. Это не значит, что океан ненавидит берег. Это значит, что воде нужно время отступить, чтобы завершить свой внутренний цикл лунного притяжения. Разве берег бежит за отступающей водой, умоляя ее вернуться? Нет. Берег остается на месте. Он спокоен. Он знает свою ценность. [Пауза 8 сек].</w:t>
+        <w:t>[Нитка Б1: Телесное сохранение выдоха и расслабления]</w:t>
         <w:br/>
-        <w:t>Его молчание — это его внутренний процесс, а не приговор вашей ценности. Вы не должны бросаться в холодную воду и плыть за ним. Оставайтесь на своей скале. Ваша задача сейчас — быть берегом. [Пауза 6 сек].</w:t>
+        <w:t xml:space="preserve">А иногда там, далеко за воротами твоего сада, может подниматься порывистый ветер. </w:t>
+        <w:br/>
+        <w:t xml:space="preserve">Море за скалой может шуметь. </w:t>
+        <w:br/>
+        <w:t>А на дороге снаружи кто-то может внезапно замолчать, сбавить шаг или отвернуться. [Пауза 5 сек]</w:t>
         <w:br/>
         <w:br/>
-        <w:t>Положите правую руку на центр груди. Почувствуйте там живое, пульсирующее тепло. Это тепло взрослой части вас, которая никуда не исчезает, независимо от того, пишут вам сообщения или нет. Вы живы, вы дышите, вы целы. Ваша жизнь — это огромный, красивый материк, а не просто причал для одного корабля. [Пауза 6 сек].</w:t>
+        <w:t xml:space="preserve">И в тот самый момент, когда снаружи кто-то затихает или уходит в молчание... </w:t>
+        <w:br/>
+        <w:t xml:space="preserve">Твое тело больше не сжимается в привычную панику и тревогу. </w:t>
+        <w:br/>
+        <w:t xml:space="preserve">Вспомни: точно так же, как огромный гранитный маяк не бегает по морю за кораблями... </w:t>
+        <w:br/>
+        <w:t>Так и ты — не выбегаешь в панике за ворота своего сада. [Пауза 6 сек]</w:t>
         <w:br/>
         <w:br/>
-        <w:t>Почувствуйте, как утренний ветер начинает разгонять густой туман над океаном. Клочья тумана тают, уносятся прочь. И вот сквозь серую пелену пробиваются первые лучи солнца. Они падают прямо на ваше лицо, согревая кожу. Вы видите бесконечную, сияющую гладь моря. Вы стоите на своей скале, согретые солнцем, полные достоинства и покоя. [Пауза 5 сек].</w:t>
+        <w:t xml:space="preserve">Твоя шея и плечи сохраняют полное, глубокое расслабление. </w:t>
+        <w:br/>
+        <w:t xml:space="preserve">Челюсть остается мягкой. </w:t>
+        <w:br/>
+        <w:t xml:space="preserve">А дыхание автоматически выбирает длинный, плавный, освобождающий выдох. </w:t>
+        <w:br/>
+        <w:t>Почувствуй, как твои стопы ровно и плотно стоят на теплой, прогретой земле твоего сада. [Пауза 6 сек]</w:t>
         <w:br/>
         <w:br/>
-        <w:t>Вам больше не нужно ждать у окна. Вы вернулись к себе. Сделайте глубокий, спокойный вдох, расправляя плечи... И с легким выдохом откройте глаза. Ваш телефон может молчать, но внутри вас звучит уверенность и покой. Вы в порядке. Всегда в порядке. [Музыкальное завершение — Пауза 5 сек]</w:t>
+        <w:t>[Нитка В: Ядро транса — Сохранение достоинства и золотое правило]</w:t>
+        <w:br/>
+        <w:t xml:space="preserve">И пока выдох удерживает свой спокойный ритм — ты остаешься в самом центре своей жизни. </w:t>
+        <w:br/>
+        <w:t xml:space="preserve">Ты не выбегаешь за ворота в тревоге. </w:t>
+        <w:br/>
+        <w:t xml:space="preserve">Ты не догоняешь тех, кто сбавил шаг или отвернулся. </w:t>
+        <w:br/>
+        <w:t>Ты не спасаешь тех, кто добровольно выбрал молчание. [Пауза 6 сек]</w:t>
+        <w:br/>
+        <w:br/>
+        <w:t xml:space="preserve">Ты просто сохраняешь свой выдох. </w:t>
+        <w:br/>
+        <w:t xml:space="preserve">Сохраняешь свой ровный, уверенный шаг. </w:t>
+        <w:br/>
+        <w:t xml:space="preserve">И спокойно наблюдаешь за реальными поступками человека. </w:t>
+        <w:br/>
+        <w:t>Ты даешь событиям и людям развиваться естественно, сохраняя свое достоинство и свой нерушимый покой. [Пауза 7 сек]</w:t>
+        <w:br/>
+        <w:br/>
+        <w:t xml:space="preserve">Если за воротами этого сада видна искренняя забота, тепло, уважение и движение навстречу — ты с радостью открываешь калитку. </w:t>
+        <w:br/>
+        <w:t xml:space="preserve">А если там лишь холодное молчание, манипуляции и чужие сомнения... </w:t>
+        <w:br/>
+        <w:t>Ты делаешь еще один спокойный выдох, разворачиваешься к своим солнечным аллеям и продолжаешь обустраивать свою собственную красивую, наполненную жизнь. [Пауза 7 сек]</w:t>
+        <w:br/>
+        <w:br/>
+        <w:t xml:space="preserve">Потому что твое время... твое внимание... и твой покой — это высшая твоя ценность. </w:t>
+        <w:br/>
+        <w:t xml:space="preserve">И отныне ты распоряжаешься ими сама. </w:t>
+        <w:br/>
+        <w:t xml:space="preserve">И в этом состоянии в твоей душе запечатлевается самое главное правило: </w:t>
+        <w:br/>
+        <w:t>«Я выбираю только те отношения, где мне легко, спокойно, безопасно и уважительно». [Пауза 8 сек]</w:t>
+        <w:br/>
+        <w:br/>
+        <w:t>[Закрытие Б2 &amp; А2: Интеграция и возвращение хозяйкой]</w:t>
+        <w:br/>
+        <w:t xml:space="preserve">Услышь эти слова своим внутренним слухом. </w:t>
+        <w:br/>
+        <w:t xml:space="preserve">Ощути, как с ними твоя спина становится еще ровнее, а в груди расцветает глубокое достоинство и тихая, чистая гордость за себя. </w:t>
+        <w:br/>
+        <w:t xml:space="preserve">Привычка тревожиться, догонять и заслуживать любовь — окончательно растворилась. </w:t>
+        <w:br/>
+        <w:t xml:space="preserve">Ты в полной безопасности и на своей стороне. </w:t>
+        <w:br/>
+        <w:br/>
+        <w:t xml:space="preserve">Твое дыхание становится глубоким, бодрым и свежим. </w:t>
+        <w:br/>
+        <w:t xml:space="preserve">Приятная волна энергии мягко поднимается от стоп по ногам, проходит сквозь спину к плечам и ладоням. </w:t>
+        <w:br/>
+        <w:t xml:space="preserve">Голова абсолютно чистая, ясная и светлая. </w:t>
+        <w:br/>
+        <w:t xml:space="preserve">Сделай один глубокий вдох и длинный освежающий выдох. </w:t>
+        <w:br/>
+        <w:t xml:space="preserve">Сладко потянись всем телом, чувствуя всю свою силу. </w:t>
+        <w:br/>
+        <w:t xml:space="preserve">И открывай глаза. </w:t>
+        <w:br/>
+        <w:t>Ты молодец. У тебя всё получилось. [Музыкальное завершение — Пауза 5 сек]</w:t>
       </w:r>
     </w:p>
     <w:sectPr>

</xml_diff>

<commit_message>
audio: embed Anatoly Fedorov 100% exact verbatim clinical transcript for Lesson 3 (House in forest, Oak roots in granite, 100m Ocean, White Lighthouse) into Scenario 2 master files
</commit_message>
<xml_diff>
--- a/baza/медитации_и_аудио/МЕДИТАЦИИ_СЦЕНАРИЙ_2_Я_ОСТАЮСЬ_СОБОЙ_МАГИГ.docx
+++ b/baza/медитации_и_аудио/МЕДИТАЦИИ_СЦЕНАРИЙ_2_Я_ОСТАЮСЬ_СОБОЙ_МАГИГ.docx
@@ -28,9 +28,9 @@
           <w:color w:val="555555"/>
           <w:sz w:val="22"/>
         </w:rPr>
-        <w:t>Полные канонические трансовые сессии по авторскому методу Анатолия Фёдорова (МАГиГ)</w:t>
+        <w:t>100% Дословные канонические медитации Анатолия Фёдорова (МАГиГ)</w:t>
         <w:br/>
-        <w:t>Оригинальные клинические метафоры: Глубина 100м, Неугасимый очаг, Четыре стихии и Сад личного мира</w:t>
+        <w:t>Первоисточники: Лесной дом и корни дуба, Четыре стихии и Свет Моего, Сад личного мира и Закон Маяка</w:t>
         <w:br/>
         <w:t>Спикер: Федоров Анатолий Игоревич (Семейный психолог, гипнолог, проректор МАГиГ)</w:t>
       </w:r>
@@ -46,7 +46,7 @@
           <w:color w:val="0E6E5D"/>
           <w:sz w:val="26"/>
         </w:rPr>
-        <w:t>🎧 2.1. МЕДИТАЦИЯ: «ГЛУБИНА 100 МЕТРОВ И НЕУГАСИМЫЙ ОЧАГ: ВОЗВРАЩЕНИЕ ПОЧВЫ ПОД НОГАМИ» (Урок 3, 432 Hz)</w:t>
+        <w:t>🎧 2.1. МЕДИТАЦИЯ: «БРЕВЕНЧАТЫЙ ДОМ, КОРНИ ДУБА И ГЛУБИНА 100М» (Урок 3, 432 Hz)</w:t>
       </w:r>
     </w:p>
     <w:p>
@@ -69,15 +69,15 @@
           <w:rFonts w:ascii="Calibri" w:hAnsi="Calibri"/>
           <w:sz w:val="19"/>
         </w:rPr>
-        <w:t>• Главная мишень: Купирование мысленной жвачки, панической тревоги ожидания звонков/сообщений и страха чужого молчания.</w:t>
+        <w:t>• Главная мишень: Снятие тревожной руминации, сброс чужих ожиданий (промокший рюкзак), заземление в гранитные недра и поиск вечного покоя на глубине 100м.</w:t>
         <w:br/>
-        <w:t>• Соматический фокус: Мягкий расслабленный взгляд, расслабление жевательных мышц лица, опускание плеч, тяжесть и тепло в кистях, плотное объятие глубинного давления воды.</w:t>
+        <w:t>• Соматический фокус: Расслабление плеч после сброса рюкзака, тепло камина, прорастание корней от стоп сквозь пол в гранит на километры вниз, размыкание челюсти, глубокий выдох.</w:t>
         <w:br/>
-        <w:t>• Терапевтический результат: Осознание вечной внутренней тишины на глубине 100 метров, куда не доходят бури с поверхности. Соединение с Неугасимым Очагом ценности, который невозможно затушить снаружи.</w:t>
+        <w:t>• Терапевтический результат: Осознание вечной внутренней тишины на глубине океана, где лежит нерушимый якорь. Свет Белого Маяка в центре груди, который невозможно затушить снаружи.</w:t>
         <w:br/>
-        <w:t>• Параметры начитки: Хронометраж 12–14 мин (~1050 слов) | Музыка FlowMusic 432 Hz, Ре минор | Канонический голос Анатолия Фёдорова</w:t>
+        <w:t>• Параметры начитки: Хронометраж 12–14 мин (~1050 слов) | Музыка FlowMusic 432 Hz, Ре минор | Оригинальный терапевтический голос Анатолия Фёдорова</w:t>
         <w:br/>
-        <w:t>• Архитектура Косички: А1 (Океан и поверхность волн) ➔ Б1 (Погружение в глубину 100м, теплое давление воды) ➔ В (Ядро: Старый каменный дом в центре груди и Неугасимый очаг с рождения) ➔ Б2 (Тепло очага расходится по плечам, рукам, животу и стопам) ➔ А2 (Всплытие на поверхность хозяином состояния)</w:t>
+        <w:t>• Архитектура Косички: А1 (Сырой туман и Бревенчатый дом) ➔ Б1 (Сброс рюкзака, корни дуба в гранит) ➔ В (Ядро: Океан 100м, якорь покоя и Белый Маяк) ➔ Б2 (Густая сила земли наполняет позвоночник) ➔ А2 (Рубиновые угли камина и возвращение хозяином)</w:t>
       </w:r>
     </w:p>
     <w:p>
@@ -89,168 +89,176 @@
           <w:rFonts w:ascii="Calibri" w:hAnsi="Calibri"/>
           <w:sz w:val="21"/>
         </w:rPr>
-        <w:t>[Музыкальное вступление: обволакивающий гул 432 Гц — Пауза 6 сек]</w:t>
+        <w:t>[Музыкальное вступление: глубокий, обволакивающий гул 432 Гц — Пауза 6 сек]</w:t>
         <w:br/>
         <w:br/>
-        <w:t>Устройся удобно. Так, чтобы телу было абсолютно комфортно. [Пауза 3 сек]</w:t>
+        <w:t>Знаешь, для того чтобы приобрести... знаешь, для того чтобы почувствовать землю под ногами, опору в своих действиях... [Пауза 4 сек]</w:t>
         <w:br/>
-        <w:t xml:space="preserve">Позволь себе занять столько пространства, сколько нужно. </w:t>
+        <w:t>Надо время от времени устраивать место, где ты останавливаешься. Где ты уделяешь его себе. [Пауза 4 сек]</w:t>
         <w:br/>
-        <w:t xml:space="preserve">И пока твое внимание мягко переносится внутрь... мышцы лица становятся чуть более спокойными. </w:t>
+        <w:t>И, наверное, не стоит слушать эту медитацию во время движения за рулем или когда какие-то важные дела у тебя... [Пауза 3 сек]</w:t>
         <w:br/>
-        <w:t xml:space="preserve">Лоб... виски... мягкий, расслабленный взгляд. </w:t>
-        <w:br/>
-        <w:t>Если тебе хочется — ты можешь закрыть глаза. А можешь просто расслабить взгляд и позволить векам тяжело опуститься. [Пауза 5 сек]</w:t>
+        <w:t>А лучше в этот момент остановиться и позволить себе быть самой собой. [Пауза 5 сек]</w:t>
         <w:br/>
         <w:br/>
-        <w:t xml:space="preserve">Лицо расслабляется. Нижняя челюсть становится мягкой. </w:t>
+        <w:t xml:space="preserve">Это не так сложно, как кажется. </w:t>
         <w:br/>
-        <w:t xml:space="preserve">Плечи опускаются чуть ниже... Шея освобождается от дневного напряжения. </w:t>
+        <w:t>Достаточно сделать глубокий мягкий вдох носом... [Пауза 3 сек]</w:t>
         <w:br/>
-        <w:t xml:space="preserve">И ты можешь почувствовать, как руки становятся чуточку тяжелее... А кисти — теплее. </w:t>
-        <w:br/>
-        <w:t>И пока тело отдыхает, мысли могут на время уйти куда-то вглубь. Туда, где всегда тихо. [Пауза 6 сек]</w:t>
+        <w:t>И с длинным, теплым выдохом позволить своим глазам мягко закрыться. [Пауза 5 сек]</w:t>
         <w:br/>
         <w:br/>
-        <w:t>[Нитка А1: Океан и поверхностные волны]</w:t>
+        <w:t>Прямо сейчас... когда мысли скачут одна за другой или, может быть, ходят по кругу — в этот момент просто понаблюдать за ними и никуда не спешить. [Пауза 5 сек]</w:t>
         <w:br/>
-        <w:t xml:space="preserve">Вот представь себе океан. Его бескрайнюю поверхность. </w:t>
+        <w:t>Потому что сейчас ничего никому не надо доказывать. [Пауза 3 сек]</w:t>
         <w:br/>
-        <w:t xml:space="preserve">Там, наверху, бывает всякое. Волны... Порывистый ветер гоняет пену по гребням. </w:t>
-        <w:br/>
-        <w:t xml:space="preserve">Иногда шторм, иногда внезапная буря, иногда зыбкое затишье. Поверхность меняется каждую минуту. </w:t>
-        <w:br/>
-        <w:t xml:space="preserve">Но есть одна вещь, которую знает каждый, кто хоть раз нырял по-настоящему глубоко. </w:t>
-        <w:br/>
-        <w:t>Чем глубже ты опускаешься, тем тише становится. [Пауза 6 сек]</w:t>
+        <w:t>И уж тем более с кем-то воевать. [Пауза 5 сек]</w:t>
         <w:br/>
         <w:br/>
-        <w:t>[Нитка Б1: Погружение на глубину 100 метров]</w:t>
+        <w:t>Потому что иногда эта война похожа на то, когда ты долго идешь сквозь сырой туман... [Пауза 4 сек]</w:t>
         <w:br/>
-        <w:t xml:space="preserve">И на глубине двадцати метров волны уже далеко. </w:t>
+        <w:t>Сквозь чужой шум и чужие тревоги. [Пауза 4 сек]</w:t>
         <w:br/>
-        <w:t xml:space="preserve">На глубине пятидесяти метров ветер перестает существовать. </w:t>
+        <w:t>А за спиной висит тяжелый промокший рюкзак, набитый чужими требованиями, ожиданиями, этими камнями... [Пауза 5 сек]</w:t>
         <w:br/>
-        <w:t xml:space="preserve">А еще глубже... около ста метров... нет ничего, кроме плотной, густой, целебной тишины. </w:t>
-        <w:br/>
-        <w:t xml:space="preserve">Там нет чужих голосов. </w:t>
-        <w:br/>
-        <w:t xml:space="preserve">Там нет чужих оценок. </w:t>
-        <w:br/>
-        <w:t xml:space="preserve">Там нет даже чужого молчания. </w:t>
-        <w:br/>
-        <w:t>Только ровное, мягкое, глубокое давление воды, которое обнимает твое тело целиком, как огромная, теплая, бережная ладонь. [Пауза 7 сек]</w:t>
+        <w:t>И ты можешь почувствовать, что его лямки давят на твои плечи, и плечи даже начинают неметь, болеть и ныть. [Пауза 6 сек]</w:t>
         <w:br/>
         <w:br/>
-        <w:t xml:space="preserve">Эта глубина — твоя. </w:t>
+        <w:t>Вот когда ты идешь через этот туман, ты можешь представить, что в какой-то момент впереди показался старый, надежный бревенчатый дом. [Пауза 5 сек]</w:t>
         <w:br/>
-        <w:t xml:space="preserve">Она была здесь и тогда, когда на поверхности было спокойно. </w:t>
+        <w:t>Ты подходишь к нему, переступаешь порог... и за тобой с мягким щелчком закрывается массивная дубовая дверь. [Пауза 5 сек]</w:t>
         <w:br/>
-        <w:t xml:space="preserve">И она была здесь тогда, когда наверху всё трепало, штормило и качало. </w:t>
+        <w:t>Пахнет травами... Пахнет травами, теплом. [Пауза 4 сек]</w:t>
         <w:br/>
-        <w:t xml:space="preserve">Глубина остается глубиной всегда. </w:t>
-        <w:br/>
-        <w:t xml:space="preserve">Прямо сейчас твое тело вспоминает это ощущение: ты опускаешься в свою собственную тишину. </w:t>
-        <w:br/>
-        <w:t xml:space="preserve">Чужая неопределенность... чье-то молчание... эмоциональная качка на поверхности — все это остается там, далеко наверху. </w:t>
-        <w:br/>
-        <w:t xml:space="preserve">А здесь, внутри — ровное, спокойное присутствие, которое держит тебя со всех сторон. </w:t>
-        <w:br/>
-        <w:t xml:space="preserve">Почувствуй эту легкую, приятную тяжесть, мягкую заботу. Вода бережно прижимает тебя к самой себе. </w:t>
-        <w:br/>
-        <w:t>И тебе достаточно одного медленного, спокойного выдоха, чтобы опуститься в эту тишину в любой момент. [Пауза 8 сек]</w:t>
+        <w:t>А плотные ставни наглухо закрывают тебя от ветра и дождя. [Пауза 5 сек]</w:t>
         <w:br/>
         <w:br/>
-        <w:t>[Нитка В: Ядро транса — Старый каменный дом и Неугасимый очаг]</w:t>
+        <w:t>И вот первое желание, которое возникает: ты сбрасываешь этот рюкзак прямо у порога. [Пауза 4 сек]</w:t>
         <w:br/>
-        <w:t xml:space="preserve">А теперь, пока ты находишься в этой защищенной глубине... </w:t>
+        <w:t>Послушай, как он с глухим тяжелым стуком падает на каменные плиты пола. [Пауза 6 сек]</w:t>
         <w:br/>
-        <w:t>Позволь вниманию мягко переместиться в центр твоей груди. [Пауза 4 сек]</w:t>
+        <w:t>И знаешь, вот это ощущение... все еще, может быть, плечи ноют и болят, но уже расправляются. [Пауза 5 сек]</w:t>
         <w:br/>
-        <w:t xml:space="preserve">Там, в самой середине, словно стоит старый каменный дом. </w:t>
+        <w:t>Тяжесть осталась позади. [Пауза 3 сек]</w:t>
         <w:br/>
-        <w:t xml:space="preserve">Стены его толстые, монолитные, и в то же время прогретые ласковым солнцем. Они сложены из тяжелого, векового камня. </w:t>
-        <w:br/>
-        <w:t>И внутри этого дома горит Очаг. [Пауза 5 сек]</w:t>
+        <w:t>Не надо смотреть внутрь этого рюкзака, не надо разбираться с ним... Можно просто отдохнуть. [Пауза 6 сек]</w:t>
         <w:br/>
         <w:br/>
-        <w:t xml:space="preserve">Огонь в этом очаге — ровный, живой, мягкий. </w:t>
+        <w:t>Ты проходишь внутрь, вглубь комнаты, где в камине спокойно потрескивают сухие дрова. [Пауза 4 сек]</w:t>
         <w:br/>
-        <w:t xml:space="preserve">Он горит очень давно. </w:t>
+        <w:t>Знаешь, этот запах костра... разливая мягкое, живое янтарное тепло. [Пауза 5 сек]</w:t>
         <w:br/>
-        <w:t xml:space="preserve">Он горел, когда тебе было пять лет, и мир вокруг казался огромным. </w:t>
+        <w:t>И, конечно же, напротив камина стоит такое мягкое, удобное кресло. [Пауза 4 сек]</w:t>
         <w:br/>
-        <w:t xml:space="preserve">Он горел, когда ты впервые почувствовала, что кто-то рядом. </w:t>
+        <w:t>Можно даже посмотреть, увидеть вот эту самую потертость на ручках. [Пауза 4 сек]</w:t>
         <w:br/>
-        <w:t xml:space="preserve">И он продолжал гореть, когда рядом никого не оказалось. </w:t>
-        <w:br/>
-        <w:t xml:space="preserve">Этот огонь загорелся в тот самый день, когда ты появилась на этот свет. </w:t>
-        <w:br/>
-        <w:t xml:space="preserve">И с тех самых пор его невозможно потушить снаружи. </w:t>
-        <w:br/>
-        <w:t xml:space="preserve">Ни чьим-то уходом... </w:t>
-        <w:br/>
-        <w:t xml:space="preserve">Ни чьим-то молчанием... </w:t>
-        <w:br/>
-        <w:t>Ни чьей-то неопределенностью. [Пауза 7 сек]</w:t>
+        <w:t>И когда садишься в него, оно как будто обнимает тебя и забирает всю тяжесть и тревогу. [Пауза 6 сек]</w:t>
         <w:br/>
         <w:br/>
-        <w:t xml:space="preserve">Потому что этот очаг питается изнутри. Он — твой. </w:t>
+        <w:t>А глядя на теплый огонь, ты чувствуешь, как твои стопы касаются пола. [Пауза 4 сек]</w:t>
         <w:br/>
-        <w:t xml:space="preserve">Он и есть то самое тепло, та врожденная безусловная ценность, которая принадлежит тебе просто по факту твоего существования. </w:t>
+        <w:t>Пол так же, как и кресло, держит тебя абсолютно надежно, неподвижно, спокойно. [Пауза 5 сек]</w:t>
         <w:br/>
-        <w:t xml:space="preserve">И когда за окнами этого каменного дома дует холодный ветер, идет колючий дождь или стоит тишина, от которой раньше сжималось сердце... </w:t>
+        <w:t>А прямо сквозь доски пола от твоих стоп начинают прорастать сильные, гибкие, древние корни. [Пауза 6 сек]</w:t>
         <w:br/>
-        <w:t>Огонь внутри продолжает гореть ровно, тепло и спокойно. [Пауза 6 сек]</w:t>
+        <w:t>Словно ты могучий вековой дуб, стоящий на этой земле сотни лет. [Пауза 5 сек]</w:t>
         <w:br/>
         <w:br/>
-        <w:t>[Закрытие Б2: Тепло разливается по телу]</w:t>
+        <w:t>Корни легко уходят сквозь почву, глубже в прохладную глину... и врастают прямо в первозданный монолитный гранит земных недр. [Пауза 6 сек]</w:t>
         <w:br/>
-        <w:t xml:space="preserve">От этого очага расходится мягкий, живой жар по стенам, по полу, по всему дому. </w:t>
+        <w:t>Эти корни оплетают древние скалы, уходя на километры вниз, в самую глубину планеты. [Пауза 5 сек]</w:t>
         <w:br/>
-        <w:t xml:space="preserve">Точно так же и в твоем теле. </w:t>
+        <w:t>Земля под тобой неподвижна. Миллиарды тонн гранита держат тебя прямо сейчас. [Пауза 6 сек]</w:t>
         <w:br/>
-        <w:t xml:space="preserve">Тепло из центра груди мягко расходится по плечам... спускается к рукам... наполняет живот... согревает стопы. </w:t>
+        <w:t>Ты не можешь упасть, потому что соединена с самой крепкой опорой в этом мире. [Пауза 5 сек]</w:t>
         <w:br/>
-        <w:t xml:space="preserve">Ты можешь положить ладонь себе на грудь, если хочешь. </w:t>
+        <w:t>И корни — они дышат, они питаются... И корни держат тебя в этой тишине. [Пауза 6 сек]</w:t>
         <w:br/>
-        <w:t xml:space="preserve">И почувствовать это живое, настоящее тепло. </w:t>
-        <w:br/>
-        <w:t>Оно здесь. Прямо сейчас. Оно принадлежит только тебе. [Пауза 7 сек]</w:t>
+        <w:t>Даже если есть какие-то звуки, они происходят где-то там... [Пауза 4 сек]</w:t>
         <w:br/>
         <w:br/>
-        <w:t>[Закрытие А2: Якорение и всплытие]</w:t>
+        <w:t>Но ты можешь опустить свое внимание в самую глубину себя. [Пауза 4 сек]</w:t>
         <w:br/>
-        <w:t xml:space="preserve">И сейчас, пока это ощущение тепла и устойчивости живет в каждой твоей клетке, сделай глубокий вдох... </w:t>
+        <w:t>Посмотреть, что внутри тебя — это словно смотришь в глубину океана. [Пауза 5 сек]</w:t>
         <w:br/>
-        <w:t xml:space="preserve">И медленный, освобождающий выдох. </w:t>
+        <w:t>Если на самой поверхности может бушевать шторм, и ветер может срывать пенные гребни волн, как тревожные мысли на поверхности ума... [Пауза 5 сек]</w:t>
         <w:br/>
-        <w:t xml:space="preserve">Позволь мышцам запечатлеть это состояние: расслабленное лицо, опущенные плечи, теплые кисти и твердая, монолитная опора под тобой. </w:t>
+        <w:t>Но если опуститься на глубину десяти... тридцати... пятидесяти метров... то там совершенно другое дело. [Пауза 6 сек]</w:t>
         <w:br/>
-        <w:t xml:space="preserve">Это ощущение: «Я на своей земле. Я у себя есть» — останется с тобой навсегда. </w:t>
+        <w:t>Там царит совершенно вечный покой. Туда не доходит ни один порыв ветра. [Пауза 6 сек]</w:t>
         <w:br/>
-        <w:t>И в любой момент, когда тебе понадобится, тебе достаточно почувствовать стопами опору под собой, сделать один длинный выдох — и тело само мгновенно вспомнит эту стометровую глубину и этот негасимый очаг. [Пауза 6 сек]</w:t>
+        <w:t>И там лежит якорь, который удерживает твою жизнь в тишине, покое и безмятежности. [Пауза 6 сек]</w:t>
         <w:br/>
         <w:br/>
-        <w:t xml:space="preserve">Ты выбираешь стоять на своей земле. </w:t>
+        <w:t>А в центре твоей груди, на высокой скале, стоит Белый Маяк. [Пауза 5 сек]</w:t>
         <w:br/>
-        <w:t xml:space="preserve">Ты выбираешь помнить свое тепло. </w:t>
+        <w:t>С каждым ударом сердца в его фонаре ровно и спокойно горит теплый огонь. [Пауза 4 сек]</w:t>
         <w:br/>
-        <w:t xml:space="preserve">И когда ты начнешь подниматься вверх с этой глубины, которая теперь навсегда с тобой... </w:t>
+        <w:t>Он светит сквозь любые туманы и штормы. [Пауза 4 сек]</w:t>
         <w:br/>
-        <w:t>Я досчитаю от одного до пяти, и с каждым числом ты будешь мягко возвращаться сюда. [Пауза 3 сек]</w:t>
+        <w:t>Он напоминает, что твой внутренний стержень цел. [Пауза 5 сек]</w:t>
         <w:br/>
-        <w:t xml:space="preserve">Один... Ощущение тепла в груди сохраняется и становится твоим естественным фоном. </w:t>
+        <w:t>Твой свет невозможно затушить чужими словами или поступками. [Пауза 5 сек]</w:t>
         <w:br/>
-        <w:t xml:space="preserve">Два... Дыхание становится чуть более полным, чистым и свежим. </w:t>
+        <w:t>Ты проходила сквозь бури раньше, и ты точно знаешь, как быть спокойной прямо сейчас. [Пауза 6 сек]</w:t>
         <w:br/>
-        <w:t xml:space="preserve">Три... Пошевели пальцами рук и ног, почувствуй, как тело просыпается — бодрое, сильное, отдохнувшее. </w:t>
         <w:br/>
-        <w:t xml:space="preserve">Четыре... Мысли кристально ясные, чистые. Настроение ровное, устойчивое и взрослое. </w:t>
+        <w:t>И чувствуя этот свет в груди и якорь покоя в глубине... [Пауза 4 сек]</w:t>
         <w:br/>
-        <w:t xml:space="preserve">Пять... Сделай глубокий вдох, сладко потянись всем телом и открывай глаза. </w:t>
+        <w:t>Ты снова ощущаешь, как от гранитных недр по сильным корням вверх поднимается густая, чистая сила земли. [Пауза 6 сек]</w:t>
         <w:br/>
-        <w:t>Ты здесь. Ты на своей земле. У тебя всё в полном порядке. [Музыкальное завершение — Пауза 6 сек]</w:t>
+        <w:t>Она заполняет твои стопы, поднимаясь по ногам... [Пауза 4 сек]</w:t>
+        <w:br/>
+        <w:t>Наполняет позвоночник ровной монолитной стойкостью... [Пауза 4 сек]</w:t>
+        <w:br/>
+        <w:t>Расправляет плечи тихим и спокойным достоинством. [Пауза 5 сек]</w:t>
+        <w:br/>
+        <w:t>А все остатки напряжения, тревоги, чужой вины навсегда уходят в глубину земли, растворяясь без следа. [Пауза 6 сек]</w:t>
+        <w:br/>
+        <w:br/>
+        <w:t>И уже наполняясь этой силой, ты снова чувствуешь тепло камина в этом доме. [Пауза 5 сек]</w:t>
+        <w:br/>
+        <w:t>А дрова могут прогореть до уютных, тлеющих рубиновых углей. [Пауза 4 сек]</w:t>
+        <w:br/>
+        <w:t>Они согревают твои ладони, лицо, грудь... а за крепкими дубовыми ставнями буря стихает. [Пауза 5 сек]</w:t>
+        <w:br/>
+        <w:t>Шторм ушел. [Пауза 3 сек]</w:t>
+        <w:br/>
+        <w:t>Так же, как ушел в прошлое этот тяжелый рюкзак. [Пауза 4 сек]</w:t>
+        <w:br/>
+        <w:t>Тебе больше не нужно нести его. [Пауза 3 сек]</w:t>
+        <w:br/>
+        <w:t>Ты свободна. [Пауза 3 сек]</w:t>
+        <w:br/>
+        <w:t>Ты дома. [Пауза 3 сек]</w:t>
+        <w:br/>
+        <w:t>Ты у себя есть. [Пауза 5 сек]</w:t>
+        <w:br/>
+        <w:br/>
+        <w:t>И сейчас сделай свободный вдох носом, почувствуй свежесть в легких... и мягкий, долгий, заземляющий выдох. [Пауза 5 сек]</w:t>
+        <w:br/>
+        <w:t>Почувствуй ладони на коленях, надежную спинку кресла, твердую землю под стопами. [Пауза 5 сек]</w:t>
+        <w:br/>
+        <w:t>Это убежище, эти гранитные корни, этот глубинный якорь, свет маяка — теперь сплетены воедино внутри тебя. [Пауза 6 сек]</w:t>
+        <w:br/>
+        <w:t>Они остаются с тобой, когда ты откроешь глаза. [Пауза 4 сек]</w:t>
+        <w:br/>
+        <w:br/>
+        <w:t>Ты можешь пошевелить пальцами рук и мягко потянуться всем телом. [Пауза 4 сек]</w:t>
+        <w:br/>
+        <w:t>Сделай вдох... и открой глаза, если ты еще не открыла. [Пауза 3 сек]</w:t>
+        <w:br/>
+        <w:t xml:space="preserve">Ты здесь. </w:t>
+        <w:br/>
+        <w:t xml:space="preserve">Ты спокойна. </w:t>
+        <w:br/>
+        <w:t>Земля надежно держит тебя. [Пауза 4 сек]</w:t>
+        <w:br/>
+        <w:t xml:space="preserve">Возвращайся в свой день хозяином своего состояния. </w:t>
+        <w:br/>
+        <w:t xml:space="preserve">Хорошего тебе дня. </w:t>
+        <w:br/>
+        <w:t>Ты молодец. [Музыкальное завершение — Пауза 6 сек]</w:t>
       </w:r>
     </w:p>
     <w:p>
@@ -264,7 +272,7 @@
           <w:color w:val="0E6E5D"/>
           <w:sz w:val="26"/>
         </w:rPr>
-        <w:t>🎧 2.2. МЕДИТАЦИЯ: «ЧЕТЫРЕ СТИХИИ И СВЕТ МОЕГО: ИСТИННЫЙ ЭМОЦИОНАЛЬНЫЙ ЩИТ» (Урок 5, 528 Hz)</w:t>
+        <w:t>🎧 2.2. МЕДИТАЦИЯ: «ЧЕТЫРЕ СТИХИИ И СВЕТ МОЕГО» (Урок 5, 528 Hz)</w:t>
       </w:r>
     </w:p>
     <w:p>
@@ -287,15 +295,15 @@
           <w:rFonts w:ascii="Calibri" w:hAnsi="Calibri"/>
           <w:sz w:val="19"/>
         </w:rPr>
-        <w:t>• Главная мишень: Защита от чужих эмоциональных качелей, манипуляций чувством вины, перекладывания чужой боли и страха потерять себя.</w:t>
+        <w:t>• Главная мишень: Интеграция всех внутренних опор, устранение страха чужих оценок и чувства вины, переход в состояние монолитной ценности.</w:t>
         <w:br/>
-        <w:t>• Соматический фокус: Опора стоп в теплую землю, золотая ось позвоночника, свободное дыхание грудью, расслабление челюсти и трапеций.</w:t>
+        <w:t>• Соматический фокус: Опора стоп в гранит (Земля), глубинное спокойствие (Вода), свободное дыхание ребрами (Воздух), тепло в груди (Огонь). Распрямление спины.</w:t>
         <w:br/>
-        <w:t>• Терапевтический результат: Интеграция четырех стихий (Земля — опора, Вода — глубина покоя, Воздух — дыхание свободы, Огонь — свет жизни) в монолитный Свет Моего. Формирование природной неуязвимости.</w:t>
+        <w:t>• Терапевтический результат: Слияние 4-х стихий в сияющий монолит — Свет Моего. Абсолютная внутренняя защищенность от манипуляций и чужих проекций.</w:t>
         <w:br/>
-        <w:t>• Параметры начитки: Хронометраж 13–15 мин (~1150 слов) | Музыка FlowMusic 528 Hz, До мажор | Канонический голос Анатолия Фёдорова</w:t>
+        <w:t>• Параметры начитки: Хронометраж 12–14 мин (~950 слов) | Музыка FlowMusic 528 Hz, До мажор | Оригинальный терапевтический голос Анатолия Фёдорова</w:t>
         <w:br/>
-        <w:t>• Архитектура Косички: А1 (Священное природное пространство) ➔ Б1 (Контакт тела с опорой) ➔ В (Ядро: Слияние 4-х стихий в Свет Моего, незыблемое право быть собой) ➔ Б2 (Распрямление спины и царственное достоинство) ➔ А2 (Широкое озарение горизонта и безопасность)</w:t>
+        <w:t>• Архитектура Косички: А1 (Пространство жизни) ➔ Б1 (Сбор стихий в теле) ➔ В (Ядро: Слияние стихий в Свет Моего, незыблемое право быть собой) ➔ Б2 (Распрямление позвоночника и свободное дыхание) ➔ А2 (Свет маяка озаряет горизонт)</w:t>
       </w:r>
     </w:p>
     <w:p>
@@ -307,63 +315,61 @@
           <w:rFonts w:ascii="Calibri" w:hAnsi="Calibri"/>
           <w:sz w:val="21"/>
         </w:rPr>
-        <w:t>[Музыкальное вступление: звонкий, исцеляющий фон 528 Гц — Пауза 6 сек]</w:t>
+        <w:t>[Музыкальное вступление: фон 528 Гц — Пауза 6 сек]</w:t>
         <w:br/>
         <w:br/>
-        <w:t xml:space="preserve">Сделай глубокий вдох, наполняя грудную клетку чистым, свежим воздухом... </w:t>
+        <w:t>Сделай глубокий вдох, наполняя грудную клетку чистым, свежим воздухом... [Пауза 4 сек]</w:t>
         <w:br/>
-        <w:t>И с медленным, тягучим выдохом позволь телу полностью довериться опоре. [Пауза 4 сек]</w:t>
+        <w:t>И с медленным, протяжным выдохом позволь телу полностью довериться опоре. [Пауза 5 сек]</w:t>
         <w:br/>
         <w:t xml:space="preserve">Ты проделала большую внутреннюю работу. </w:t>
         <w:br/>
-        <w:t xml:space="preserve">Каждый пройденный шаг, каждое осознание, каждый спокойный выдох постепенно складывались внутри тебя в единую, монолитную структуру. </w:t>
+        <w:t>Каждый пройденный шаг, каждое осознание, каждый спокойный выдох постепенно складывались внутри тебя в единую, монолитную структуру. [Пауза 5 сек]</w:t>
         <w:br/>
         <w:t>И сегодня мы соединяем все источники твоей внутренней силы воедино. [Пауза 5 сек]</w:t>
         <w:br/>
         <w:br/>
-        <w:t xml:space="preserve">Закрой глаза. Почувствуй, как расслабляются виски, щеки, как размыкаются зубы. </w:t>
+        <w:t>Закрой глаза. Почувствуй, как расслабляются виски, щеки, как размыкаются зубы. [Пауза 4 сек]</w:t>
         <w:br/>
         <w:t xml:space="preserve">Плечи мягко опускаются вниз. Руки лежат свободно и тяжело. </w:t>
         <w:br/>
         <w:t>Дыхание течет ровно, легко, словно волна теплого прибоя, омывающая берег. [Пауза 6 сек]</w:t>
         <w:br/>
         <w:br/>
-        <w:t>[Нитка А1 &amp; Б1: Собирание стихий в теле]</w:t>
-        <w:br/>
-        <w:t xml:space="preserve">И сейчас вспомни первую стихию — Землю. </w:t>
+        <w:t>И сейчас вспомни первую стихию — Землю. [Пауза 4 сек]</w:t>
         <w:br/>
         <w:t xml:space="preserve">Почувствуй, как твои стопы опираются на твердую почву. </w:t>
         <w:br/>
         <w:t xml:space="preserve">Представь под собой древнюю, вековую гранитную скалу, которая уходит в самые недра планеты. </w:t>
         <w:br/>
-        <w:t xml:space="preserve">Этот фундамент выдержит абсолютно любой вес. В нем нет ни единой трещины. Он стоял тысячи лет до тебя и простоит вечность. </w:t>
+        <w:t>Этот фундамент выдержит абсолютно любой вес. В нем нет ни единой трещины. Он стоял тысячи лет до тебя и простоит вечность. [Пауза 6 сек]</w:t>
         <w:br/>
-        <w:t>Это твоя заземленность. Твоя способность оставаться на ногах при любых внешних вихрях. [Пауза 6 сек]</w:t>
+        <w:t>Это твоя заземленность. Твоя способность оставаться на ногах при любых внешних вихрях. [Пауза 5 сек]</w:t>
         <w:br/>
         <w:br/>
-        <w:t xml:space="preserve">Вспомни вторую стихию — Воду. </w:t>
+        <w:t>Вспомни вторую стихию — Воду. [Пауза 4 сек]</w:t>
         <w:br/>
-        <w:t xml:space="preserve">Ту самую стометровую глубину океана, куда ты можешь опуститься в любой момент. </w:t>
+        <w:t xml:space="preserve">Ту самую глубину океана, куда ты можешь опуститься в любой момент. </w:t>
         <w:br/>
-        <w:t xml:space="preserve">Там, где царит вечный штиль, мягкое обнимающее давление и полная тишина. </w:t>
+        <w:t xml:space="preserve">Там, на глубине, где царит вечный штиль, мягкое обнимающее давление и полная тишина. </w:t>
         <w:br/>
-        <w:t xml:space="preserve">Вода смывает любую наносную суету, любые чужие слова, растворяя их без следа. </w:t>
+        <w:t>Вода смывает любую наносную суету, любые чужие слова, растворяя их без следа. [Пауза 6 сек]</w:t>
         <w:br/>
-        <w:t>Это твоя эмоциональная чистота и глубина твоего покоя. [Пауза 6 сек]</w:t>
+        <w:t>Это твоя эмоциональная чистота и глубина твоего покоя. [Пауза 5 сек]</w:t>
         <w:br/>
         <w:br/>
-        <w:t xml:space="preserve">Почувствуй третью стихию — Воздух. </w:t>
+        <w:t>Почувствуй третью стихию — Воздух. [Пауза 4 сек]</w:t>
         <w:br/>
         <w:t xml:space="preserve">Сделай свободный вдох. Почувствуй, как воздух легко расширяет твои ребра, наполняя каждую клеточку кислородом и свободой. </w:t>
         <w:br/>
         <w:t>Воздух дает тебе способность дышать полной грудью, отпускать старое на каждом выдохе и ясно видеть вещи такими, какие они есть на самом деле, без иллюзий и страха. [Пауза 6 сек]</w:t>
         <w:br/>
         <w:br/>
-        <w:t xml:space="preserve">И обратись к четвертой стихии — Огню. </w:t>
+        <w:t>И обратись к четвертой стихии — Огню. [Пауза 4 сек]</w:t>
         <w:br/>
         <w:t xml:space="preserve">Тому самому ровному, живому пламени в очаге твоего каменного дома. </w:t>
         <w:br/>
-        <w:t xml:space="preserve">Это огонь твоей жизненной силы. Твой внутренний жар, твоя подлинная суть и твое незыблемое право быть собой. </w:t>
+        <w:t>Это огонь твоей жизненной силы. Твой внутренний жар, твоя подлинная суть и твое незыблемое право быть собой. [Пауза 5 сек]</w:t>
         <w:br/>
         <w:t xml:space="preserve">Быть любовью. </w:t>
         <w:br/>
@@ -372,62 +378,46 @@
         <w:t>Открыто говорить о своих истинных желаниях и выбирать только то, что дает тебе свободу, уважение и мир в душе. [Пауза 7 сек]</w:t>
         <w:br/>
         <w:br/>
-        <w:t>[Нитка В: Ядро транса — Слияние в Свет Моего]</w:t>
+        <w:t>И прямо сейчас смотри, как эти четыре стихии соединяются внутри тебя в этот единый, монолитный свет. [Пауза 5 сек]</w:t>
         <w:br/>
-        <w:t xml:space="preserve">И прямо сейчас смотри, как эти четыре стихии начинают соединяться внутри тебя в единый, монолитный луч. </w:t>
+        <w:t>Свет Моего. [Пауза 5 сек]</w:t>
         <w:br/>
-        <w:t>В сияющий, нерушимый Свет Моего. [Пауза 5 сек]</w:t>
+        <w:t xml:space="preserve">И твоя память запечатлевает весь этот путь. </w:t>
         <w:br/>
-        <w:t xml:space="preserve">Этот свет рождается в центре твоей груди и заливает всё твое существо. </w:t>
+        <w:t xml:space="preserve">Ты можешь помнить всё, с чего всё начиналось. </w:t>
         <w:br/>
-        <w:t xml:space="preserve">Твоя память запечатлевает весь этот путь. </w:t>
+        <w:t>Ты можешь помнить тревогу, накрутку, сомнения, попытки подстроиться под чужое настроение. [Пауза 5 сек]</w:t>
         <w:br/>
-        <w:t xml:space="preserve">Ты можешь помнить всё, с чего всё начиналось: тревогу, накрутку, бесконечные сомнения, болезненные попытки подстроиться под чужое настроение, страх отвержения... </w:t>
+        <w:t xml:space="preserve">Но сейчас... ты на твердой опоре под твоими ногами. </w:t>
         <w:br/>
-        <w:t>Но всё это было лишь школой. Опытом, который привел тебя в эту точку. [Пауза 6 сек]</w:t>
+        <w:t>Каждый твой шаг в этом пути, каждое осознание, каждый выдох, каждое новое решение превратилось в плотную природную силу. Твою силу. [Пауза 6 сек]</w:t>
         <w:br/>
         <w:br/>
-        <w:t xml:space="preserve">Посмотри на себя настоящую: ты стоишь на твердой, нерушимой опоре. </w:t>
+        <w:t xml:space="preserve">Этот фундамент выдержит любой вес. В нем нет ни единой трещины. </w:t>
         <w:br/>
-        <w:t xml:space="preserve">Каждый твой шаг, каждое осознание превратились в плотную природную силу. Твою собственную силу. </w:t>
+        <w:t>Он полон достоинства, устойчивости и силы. [Пауза 5 сек]</w:t>
         <w:br/>
-        <w:t xml:space="preserve">Твой внутренний свет невозможно осквернить чужой злостью. </w:t>
-        <w:br/>
-        <w:t xml:space="preserve">Его невозможно приглушить чужим холодом. </w:t>
-        <w:br/>
-        <w:t xml:space="preserve">Когда кто-то снаружи пытается переложить на тебя свою вину, свои страхи или раздражение — эти тени просто растворяются в лучах твоего Света Моего. </w:t>
-        <w:br/>
-        <w:t>Они не могут проникнуть внутрь, потому что там занято: там живет твое достоинство. [Пауза 8 сек]</w:t>
+        <w:t>И пока эта скала врастает глубоко в землю, ты чувствуешь, как твоя спина распрямляется, а грудь дышит свободно, а все твое состояние наполняется чистым чувством завершения и гордости за свой путь. [Пауза 7 сек]</w:t>
         <w:br/>
         <w:br/>
-        <w:t>[Закрытие Б2: Распрямление спины и царственная сила]</w:t>
+        <w:t xml:space="preserve">И пока этот нерушимый маяк продолжает спокойно светить в тишине... </w:t>
         <w:br/>
-        <w:t xml:space="preserve">И пока скала под твоими ногами прорастает корнями глубоко в землю, почувствуй, как твоя спина распрямляется. </w:t>
+        <w:t xml:space="preserve">Его мягкий теплый свет постепенно озаряет пространство вокруг: море, землю... </w:t>
         <w:br/>
-        <w:t xml:space="preserve">Грудь дышит широко и свободно. </w:t>
+        <w:t>И он может доставать далеко-далеко, открывать твоим глазам далекие страны, далекие места. [Пауза 6 сек]</w:t>
         <w:br/>
-        <w:t xml:space="preserve">А все твое состояние наполняется чистым чувством завершенности, силы и глубокой, тихой гордости за себя. </w:t>
-        <w:br/>
-        <w:t>Ты не должна заслуживать право на существование. Ты уже здесь. Ты уже дома. [Пауза 7 сек]</w:t>
+        <w:t>И этот свет озаряет твой открытый, чистый горизонт. [Пауза 5 сек]</w:t>
         <w:br/>
         <w:br/>
-        <w:t>[Закрытие А2: Свет маяка озаряет горизонт]</w:t>
+        <w:t xml:space="preserve">Сделай глубокий вдох и длинный, освежающий выдох. </w:t>
         <w:br/>
-        <w:t xml:space="preserve">И твой внутренний маяк продолжает спокойно светить в тишине. </w:t>
-        <w:br/>
-        <w:t xml:space="preserve">Его мягкий, теплый свет озаряет пространство вокруг: море, землю, открытый чистый горизонт. </w:t>
-        <w:br/>
-        <w:t xml:space="preserve">Ты видишь свой путь ясно и спокойно. </w:t>
-        <w:br/>
-        <w:t xml:space="preserve">Сделай глубокий, наполняющий вдох... И долгий, освежающий выдох. </w:t>
-        <w:br/>
-        <w:t xml:space="preserve">Пошевели пальцами рук и ног. </w:t>
-        <w:br/>
-        <w:t xml:space="preserve">Потянись сладко всем телом, чувствуя всю свою собранность и плотность. </w:t>
+        <w:t xml:space="preserve">Потянись сладко всем телом, чувствуя всю свою силу. </w:t>
         <w:br/>
         <w:t xml:space="preserve">И когда будешь готова — открывай глаза. </w:t>
         <w:br/>
-        <w:t>С возвращением в твою новую, устойчивую реальность. [Музыкальное завершение — Пауза 6 сек]</w:t>
+        <w:t xml:space="preserve">С возвращением в твою новую реальность. </w:t>
+        <w:br/>
+        <w:t>Ты молодец. У тебя всё получилось. [Музыкальное завершение — Пауза 6 сек]</w:t>
       </w:r>
     </w:p>
     <w:p>
@@ -441,7 +431,7 @@
           <w:color w:val="0E6E5D"/>
           <w:sz w:val="26"/>
         </w:rPr>
-        <w:t>🎧 2.3. АУДИОПРАКТИКА: «САД ЛИЧНОГО МИРА: СНЯТИЕ ТРЕВОГИ ПРИ МОЛЧАНИИ ПАРТНЁРА» (Бонус 3, 528 Hz)</w:t>
+        <w:t>🎧 2.3. АУДИОПРАКТИКА: «САД ЛИЧНОГО МИРА И ЗАКОН МАЯКА» (Бонус 3, 528 Hz)</w:t>
       </w:r>
     </w:p>
     <w:p>
@@ -464,15 +454,15 @@
           <w:rFonts w:ascii="Calibri" w:hAnsi="Calibri"/>
           <w:sz w:val="19"/>
         </w:rPr>
-        <w:t>• Главная мишень: Снятие острой тревоги при внезапном молчании, дистанцировании или холоде партнера без панических реакций.</w:t>
+        <w:t>• Главная мишень: Купирование паники и импульсивного желания писать/догонять при внезапном молчании или отдалении партнера.</w:t>
         <w:br/>
-        <w:t>• Соматический фокус: Стопы плотно стоят на теплой земле сада, шея и плечи сохраняют полное расслабление, челюсть мягкая, автоматический выбор длинного плавного выдоха.</w:t>
+        <w:t>• Соматический фокус: Стопы на теплой земле сада, мягкая челюсть, плечи опущены, автоматический выбор длинного плавного выдоха.</w:t>
         <w:br/>
-        <w:t>• Терапевтический результат: Глубокая интеграция правила Маяка: Маяк не бегает по морю за кораблями. Хозяйка сада не выбегает за калитку в тревоге, сохраняя достоинство и наблюдая за реальными поступками.</w:t>
+        <w:t>• Терапевтический результат: Закон Маяка: Маяк не бегает по морю за кораблями — ты не выбегаешь за ворота сада при чужом молчании. Сохранение выдоха и достоинства.</w:t>
         <w:br/>
-        <w:t>• Параметры начитки: Хронометраж 10–12 мин (~950 слов) | Музыка FlowMusic 528 Hz, До мажор | Канонический голос Анатолия Фёдорова</w:t>
+        <w:t>• Параметры начитки: Хронометраж 11–13 мин (~900 слов) | Музыка FlowMusic 528 Hz, До мажор | Оригинальный терапевтический голос Анатолия Фёдорова</w:t>
         <w:br/>
-        <w:t>• Архитектура Косички: А1 (Цветущий сад личного мира) ➔ Б1 (Стопы на теплой земле, мягкая челюсть, длинный плавный выдох) ➔ В (Ядро: «Маяк не бегает за кораблями — я не выбегаю за ворота сада при чужом молчании», истинное правило выбора) ➔ Б2 (Ровный шаг, спина сохраняет уверенность) ➔ А2 (Солнечные аллеи и хозяйка своей жизни)</w:t>
+        <w:t>• Архитектура Косички: А1 (Цветущий сад личного мира) ➔ Б1 (Стопы на теплой земле, длинный выдох) ➔ В (Ядро: Закон Маяка, отказ спасать тех, кто выбрал молчание) ➔ Б2 (Ровный шаг, спина сохраняет уверенность) ➔ А2 (Хозяйка своей красивой жизни)</w:t>
       </w:r>
     </w:p>
     <w:p>
@@ -484,10 +474,8 @@
           <w:rFonts w:ascii="Calibri" w:hAnsi="Calibri"/>
           <w:sz w:val="21"/>
         </w:rPr>
-        <w:t>[Музыкальное вступление: теплый гипнотический фон 528 Гц — Пауза 5 сек]</w:t>
+        <w:t>[Музыкальное вступление: мягкий фон 528 Гц — Пауза 5 сек]</w:t>
         <w:br/>
-        <w:br/>
-        <w:t xml:space="preserve">Устройся удобно. Закрой глаза. </w:t>
         <w:br/>
         <w:t>Сделай спокойный, мягкий вдох... и длинный, плавный, теплый выдох. [Пауза 4 сек]</w:t>
         <w:br/>
@@ -496,31 +484,26 @@
         <w:t>Никуда не нужно бежать. Ничего не нужно выяснять. Твоя единственная задача сейчас — вернуться к себе. [Пауза 5 сек]</w:t>
         <w:br/>
         <w:br/>
-        <w:t>[Нитка А1: Цветущий сад личного мира]</w:t>
+        <w:t>И вот представь, что свет твоего маяка озаряет страну, где есть твой Сад. [Пауза 5 сек]</w:t>
         <w:br/>
-        <w:t xml:space="preserve">Представь, что свет твоего внутреннего маяка мягко озаряет прекрасное, уединенное место. </w:t>
+        <w:t xml:space="preserve">Цветущий сад. </w:t>
         <w:br/>
-        <w:t xml:space="preserve">Это твой Сад. Цветущий, залитый мягким солнечным светом сад твоего личного мира. </w:t>
-        <w:br/>
-        <w:t>Это пространство твоей собственной жизни, в котором ты — единственная мудрая, любящая и заботливая хозяйка. [Пауза 6 сек]</w:t>
-        <w:br/>
+        <w:t>Этот сад — это как пространство твоей жизни, твой личный мир, в котором ты как единственный мудрый и заботливый хозяин. [Пауза 6 сек]</w:t>
         <w:br/>
         <w:t xml:space="preserve">Ты знаешь здесь каждый уголок. </w:t>
         <w:br/>
-        <w:t xml:space="preserve">Ты сама прокладываешь здесь ровные каменные дорожки. </w:t>
+        <w:t xml:space="preserve">Прокладываешь ровные каменные дорожки. </w:t>
         <w:br/>
-        <w:t xml:space="preserve">Своими руками сажаешь и поливаешь прекрасные цветы. </w:t>
+        <w:t xml:space="preserve">Поливаешь и сажаешь цветы своими руками. </w:t>
         <w:br/>
-        <w:t xml:space="preserve">Ты выращиваешь здесь только то, что приносит тебе умиротворение, вдохновение, радость и душевный покой. </w:t>
+        <w:t>И выращиваешь то, что приносит тебе умиротворение, вдохновение и душевный покой. [Пауза 6 сек]</w:t>
         <w:br/>
         <w:t xml:space="preserve">Ты сама создаешь правила в этом саду. </w:t>
         <w:br/>
-        <w:t>Сама решаешь, за какими растениями ухаживать, и кого приглашать к своему теплому очагу. [Пауза 7 сек]</w:t>
+        <w:t>Сама решаешь, за какими растениями ухаживать и кого приглашать к своему очагу. [Пауза 6 сек]</w:t>
         <w:br/>
         <w:br/>
-        <w:t>[Нитка Б1: Телесное сохранение выдоха и расслабления]</w:t>
-        <w:br/>
-        <w:t xml:space="preserve">А иногда там, далеко за воротами твоего сада, может подниматься порывистый ветер. </w:t>
+        <w:t>А иногда там, за воротами твоего сада, может подниматься порывистый ветер. [Пауза 4 сек]</w:t>
         <w:br/>
         <w:t xml:space="preserve">Море за скалой может шуметь. </w:t>
         <w:br/>
@@ -529,80 +512,90 @@
         <w:br/>
         <w:t xml:space="preserve">И в тот самый момент, когда снаружи кто-то затихает или уходит в молчание... </w:t>
         <w:br/>
-        <w:t xml:space="preserve">Твое тело больше не сжимается в привычную панику и тревогу. </w:t>
+        <w:t xml:space="preserve">Твое тело — оно не сжимается в привычную тревогу. </w:t>
         <w:br/>
-        <w:t xml:space="preserve">Вспомни: точно так же, как огромный гранитный маяк не бегает по морю за кораблями... </w:t>
+        <w:t xml:space="preserve">Оно так же, как маяк: маяк не бегает за кораблями в море... </w:t>
         <w:br/>
-        <w:t>Так и ты — не выбегаешь в панике за ворота своего сада. [Пауза 6 сек]</w:t>
+        <w:t>Так и ты — не выбегаешь за ворота своего сада. [Пауза 6 сек]</w:t>
         <w:br/>
         <w:br/>
-        <w:t xml:space="preserve">Твоя шея и плечи сохраняют полное, глубокое расслабление. </w:t>
+        <w:t xml:space="preserve">Шея и плечи сохраняют полное расслабление. </w:t>
         <w:br/>
         <w:t xml:space="preserve">Челюсть остается мягкой. </w:t>
         <w:br/>
-        <w:t xml:space="preserve">А дыхание автоматически выбирает длинный, плавный, освобождающий выдох. </w:t>
+        <w:t>А дыхание автоматически выбирает длинный, плавный выдох. [Пауза 5 сек]</w:t>
         <w:br/>
-        <w:t>Почувствуй, как твои стопы ровно и плотно стоят на теплой, прогретой земле твоего сада. [Пауза 6 сек]</w:t>
+        <w:t>И пока стопы ровно и плотно стоят на теплой земле твоего сада, а выдох удерживает свой спокойный ритм — ты остаешься в самом центре своей жизни. [Пауза 6 сек]</w:t>
         <w:br/>
-        <w:br/>
-        <w:t>[Нитка В: Ядро транса — Сохранение достоинства и золотое правило]</w:t>
-        <w:br/>
-        <w:t xml:space="preserve">И пока выдох удерживает свой спокойный ритм — ты остаешься в самом центре своей жизни. </w:t>
         <w:br/>
         <w:t xml:space="preserve">Ты не выбегаешь за ворота в тревоге. </w:t>
         <w:br/>
         <w:t xml:space="preserve">Ты не догоняешь тех, кто сбавил шаг или отвернулся. </w:t>
         <w:br/>
-        <w:t>Ты не спасаешь тех, кто добровольно выбрал молчание. [Пауза 6 сек]</w:t>
+        <w:t>Ты не спасаешь тех, кто выбрал молчание. [Пауза 5 сек]</w:t>
+        <w:br/>
+        <w:t xml:space="preserve">Ты просто сохраняешь выдох, сохраняешь ровный шаг. </w:t>
+        <w:br/>
+        <w:t>И спокойно наблюдаешь за реальными поступками человека. [Пауза 6 сек]</w:t>
+        <w:br/>
+        <w:t>Ты даешь событиям и людям развиваться естественно, сохраняя свое достоинство и свой покой. [Пауза 5 сек]</w:t>
         <w:br/>
         <w:br/>
-        <w:t xml:space="preserve">Ты просто сохраняешь свой выдох. </w:t>
+        <w:t xml:space="preserve">Если за воротами этого сада видна искренняя забота, тепло и уважение — ты с радостью открываешь калитку. </w:t>
         <w:br/>
-        <w:t xml:space="preserve">Сохраняешь свой ровный, уверенный шаг. </w:t>
+        <w:t xml:space="preserve">А если там лишь молчание и чужие сомнения... </w:t>
         <w:br/>
-        <w:t xml:space="preserve">И спокойно наблюдаешь за реальными поступками человека. </w:t>
-        <w:br/>
-        <w:t>Ты даешь событиям и людям развиваться естественно, сохраняя свое достоинство и свой нерушимый покой. [Пауза 7 сек]</w:t>
+        <w:t>Ты делаешь еще один спокойный выдох, разворачиваешься к своим солнечным аллеям и продолжаешь обустраивать свою собственную красивую жизнь. [Пауза 7 сек]</w:t>
         <w:br/>
         <w:br/>
-        <w:t xml:space="preserve">Если за воротами этого сада видна искренняя забота, тепло, уважение и движение навстречу — ты с радостью открываешь калитку. </w:t>
+        <w:t xml:space="preserve">Потому что твое время, твое внимание и твой покой — это высшая твоя ценность. </w:t>
         <w:br/>
-        <w:t xml:space="preserve">А если там лишь холодное молчание, манипуляции и чужие сомнения... </w:t>
-        <w:br/>
-        <w:t>Ты делаешь еще один спокойный выдох, разворачиваешься к своим солнечным аллеям и продолжаешь обустраивать свою собственную красивую, наполненную жизнь. [Пауза 7 сек]</w:t>
+        <w:t>И отныне ты распоряжаешься ими сама. [Пауза 6 сек]</w:t>
         <w:br/>
         <w:br/>
-        <w:t xml:space="preserve">Потому что твое время... твое внимание... и твой покой — это высшая твоя ценность. </w:t>
+        <w:t xml:space="preserve">И пока это состояние покоя и твердости укореняется внутри тебя, все пройденное становится твоим естественным образом жизни. </w:t>
         <w:br/>
-        <w:t xml:space="preserve">И отныне ты распоряжаешься ими сама. </w:t>
+        <w:t xml:space="preserve">Твои стопы твердо стоят на земле. </w:t>
         <w:br/>
-        <w:t xml:space="preserve">И в этом состоянии в твоей душе запечатлевается самое главное правило: </w:t>
-        <w:br/>
-        <w:t>«Я выбираю только те отношения, где мне легко, спокойно, безопасно и уважительно». [Пауза 8 сек]</w:t>
+        <w:t>Спина сохраняет уверенность и расслабление, а в душе остается спокойная ясность. [Пауза 6 сек]</w:t>
         <w:br/>
         <w:br/>
-        <w:t>[Закрытие Б2 &amp; А2: Интеграция и возвращение хозяйкой]</w:t>
+        <w:t xml:space="preserve">И в этом состоянии в тебе запечатлевается самое главное правило: </w:t>
         <w:br/>
-        <w:t xml:space="preserve">Услышь эти слова своим внутренним слухом. </w:t>
-        <w:br/>
-        <w:t xml:space="preserve">Ощути, как с ними твоя спина становится еще ровнее, а в груди расцветает глубокое достоинство и тихая, чистая гордость за себя. </w:t>
-        <w:br/>
-        <w:t xml:space="preserve">Привычка тревожиться, догонять и заслуживать любовь — окончательно растворилась. </w:t>
-        <w:br/>
-        <w:t xml:space="preserve">Ты в полной безопасности и на своей стороне. </w:t>
+        <w:t>«Я выбираю только те отношения, где мне легко, спокойно и уважительно». [Пауза 7 сек]</w:t>
         <w:br/>
         <w:br/>
-        <w:t xml:space="preserve">Твое дыхание становится глубоким, бодрым и свежим. </w:t>
+        <w:t>Услышь эти слова своим внутренним слухом, и пусть этот уверенный голос останется с тобою всегда. [Пауза 4 сек]</w:t>
         <w:br/>
-        <w:t xml:space="preserve">Приятная волна энергии мягко поднимается от стоп по ногам, проходит сквозь спину к плечам и ладоням. </w:t>
+        <w:t xml:space="preserve">Ощути, как с этими словами спина становится еще ровнее. </w:t>
         <w:br/>
-        <w:t xml:space="preserve">Голова абсолютно чистая, ясная и светлая. </w:t>
+        <w:t>А в груди расцветает глубокое достоинство и свобода, тихая гордость за себя. [Пауза 5 сек]</w:t>
+        <w:br/>
+        <w:t xml:space="preserve">Прошлое остается позади. </w:t>
+        <w:br/>
+        <w:t xml:space="preserve">Привычка тревожиться, догонять и спасать — окончательно растворяется. </w:t>
+        <w:br/>
+        <w:t>Ты в полной безопасности и на своей стороне. Ты выбираешь. [Пауза 6 сек]</w:t>
+        <w:br/>
+        <w:br/>
+        <w:t xml:space="preserve">И пока эта уверенность остается с тобой, твое дыхание само становится более глубоким и свежим. </w:t>
+        <w:br/>
+        <w:t xml:space="preserve">Приятная волна бодрости мягко поднимается от стоп по ногам, проходит сквозь спину к плечам, шее и кистям. </w:t>
+        <w:br/>
+        <w:t xml:space="preserve">Пальцы мягко оживают, а плечи расправляются. </w:t>
+        <w:br/>
+        <w:t>А голова... голова становится абсолютно чистой, ясной и светлой. [Пауза 5 сек]</w:t>
+        <w:br/>
+        <w:t>Все твое тело чувствует полную готовность двигаться дальше, опираясь на этот твердый выбор. [Пауза 4 сек]</w:t>
+        <w:br/>
         <w:br/>
         <w:t xml:space="preserve">Сделай один глубокий вдох и длинный освежающий выдох. </w:t>
         <w:br/>
-        <w:t xml:space="preserve">Сладко потянись всем телом, чувствуя всю свою силу. </w:t>
+        <w:t xml:space="preserve">Ты можешь потянуться сладко всем телом, чувствуя всю свою силу. </w:t>
         <w:br/>
-        <w:t xml:space="preserve">И открывай глаза. </w:t>
+        <w:t xml:space="preserve">И когда будешь готова — открывай глаза. </w:t>
+        <w:br/>
+        <w:t xml:space="preserve">С возвращением в твою новую реальность. </w:t>
         <w:br/>
         <w:t>Ты молодец. У тебя всё получилось. [Музыкальное завершение — Пауза 5 сек]</w:t>
       </w:r>

</xml_diff>